<commit_message>
9 and 10 laboratory works are done
</commit_message>
<xml_diff>
--- a/Laboratory work №9.docx
+++ b/Laboratory work №9.docx
@@ -559,6 +559,11 @@
         </w:rPr>
         <w:t xml:space="preserve">Chapter 15 - System and User Security </w:t>
       </w:r>
+      <w:r>
+        <w:rPr>
+          <w:rtl w:val="0"/>
+        </w:rPr>
+      </w:r>
     </w:p>
     <w:p>
       <w:pPr>
@@ -586,6 +591,11 @@
         </w:rPr>
         <w:t xml:space="preserve">Chapter 16 - Creating Users and Groups</w:t>
       </w:r>
+      <w:r>
+        <w:rPr>
+          <w:rtl w:val="0"/>
+        </w:rPr>
+      </w:r>
     </w:p>
     <w:p>
       <w:pPr>
@@ -773,25 +783,7 @@
           <w:szCs w:val="28"/>
           <w:rtl w:val="0"/>
         </w:rPr>
-        <w:t xml:space="preserve"> Зазвичай це налаштовано разом з </w:t>
-      </w:r>
-      <w:r>
-        <w:rPr>
-          <w:rFonts w:ascii="Times New Roman" w:cs="Times New Roman" w:eastAsia="Times New Roman" w:hAnsi="Times New Roman"/>
-          <w:sz w:val="28"/>
-          <w:szCs w:val="28"/>
-          <w:rtl w:val="0"/>
-        </w:rPr>
-        <w:t xml:space="preserve">umask 002</w:t>
-      </w:r>
-      <w:r>
-        <w:rPr>
-          <w:rFonts w:ascii="Times New Roman" w:cs="Times New Roman" w:eastAsia="Times New Roman" w:hAnsi="Times New Roman"/>
-          <w:sz w:val="28"/>
-          <w:szCs w:val="28"/>
-          <w:rtl w:val="0"/>
-        </w:rPr>
-        <w:t xml:space="preserve">. Це означає, що користувач створює файли, які доступні для запису групі (rwxrw----). Оскільки в особистій групі тільки він сам, це безпечно.</w:t>
+        <w:t xml:space="preserve"> Зазвичай це налаштовано разом з umask 002. Це означає, що користувач створює файли, які доступні для запису групі (rwxrw----). Оскільки в особистій групі тільки він сам, це безпечно.</w:t>
       </w:r>
     </w:p>
     <w:p>
@@ -875,25 +867,7 @@
           <w:szCs w:val="28"/>
           <w:rtl w:val="0"/>
         </w:rPr>
-        <w:t xml:space="preserve"> біт, всі файли, створені різними користувачами, будуть доступні для редагування іншим учасникам групи без необхідності вручну змінювати права доступу (</w:t>
-      </w:r>
-      <w:r>
-        <w:rPr>
-          <w:rFonts w:ascii="Times New Roman" w:cs="Times New Roman" w:eastAsia="Times New Roman" w:hAnsi="Times New Roman"/>
-          <w:sz w:val="28"/>
-          <w:szCs w:val="28"/>
-          <w:rtl w:val="0"/>
-        </w:rPr>
-        <w:t xml:space="preserve">chmod</w:t>
-      </w:r>
-      <w:r>
-        <w:rPr>
-          <w:rFonts w:ascii="Times New Roman" w:cs="Times New Roman" w:eastAsia="Times New Roman" w:hAnsi="Times New Roman"/>
-          <w:sz w:val="28"/>
-          <w:szCs w:val="28"/>
-          <w:rtl w:val="0"/>
-        </w:rPr>
-        <w:t xml:space="preserve">).</w:t>
+        <w:t xml:space="preserve"> біт, всі файли, створені різними користувачами, будуть доступні для редагування іншим учасникам групи без необхідності вручну змінювати права доступу (chmod).</w:t>
       </w:r>
     </w:p>
     <w:p>
@@ -970,43 +944,7 @@
           <w:szCs w:val="28"/>
           <w:rtl w:val="0"/>
         </w:rPr>
-        <w:t xml:space="preserve">Для створення нових груп користувачів в операційній системі Linux використовується команда groupadd. Щоб створити стандартну групу, достатньо ввести цю команду, за якою вказати бажану назву групи. Якщо виникає потреба задати конкретний числовий ідентифікатор групи (Group ID або GID), до команди додається спеціальна опція </w:t>
-      </w:r>
-      <w:r>
-        <w:rPr>
-          <w:rFonts w:ascii="Times New Roman" w:cs="Times New Roman" w:eastAsia="Times New Roman" w:hAnsi="Times New Roman"/>
-          <w:sz w:val="28"/>
-          <w:szCs w:val="28"/>
-          <w:rtl w:val="0"/>
-        </w:rPr>
-        <w:t xml:space="preserve">-g</w:t>
-      </w:r>
-      <w:r>
-        <w:rPr>
-          <w:rFonts w:ascii="Times New Roman" w:cs="Times New Roman" w:eastAsia="Times New Roman" w:hAnsi="Times New Roman"/>
-          <w:sz w:val="28"/>
-          <w:szCs w:val="28"/>
-          <w:rtl w:val="0"/>
-        </w:rPr>
-        <w:t xml:space="preserve"> із відповідним числом. У випадках, коли створюється група для системних потреб або сервісів, які зазвичай мають нижчі GID, застосовується опція </w:t>
-      </w:r>
-      <w:r>
-        <w:rPr>
-          <w:rFonts w:ascii="Times New Roman" w:cs="Times New Roman" w:eastAsia="Times New Roman" w:hAnsi="Times New Roman"/>
-          <w:sz w:val="28"/>
-          <w:szCs w:val="28"/>
-          <w:rtl w:val="0"/>
-        </w:rPr>
-        <w:t xml:space="preserve">-r</w:t>
-      </w:r>
-      <w:r>
-        <w:rPr>
-          <w:rFonts w:ascii="Times New Roman" w:cs="Times New Roman" w:eastAsia="Times New Roman" w:hAnsi="Times New Roman"/>
-          <w:sz w:val="28"/>
-          <w:szCs w:val="28"/>
-          <w:rtl w:val="0"/>
-        </w:rPr>
-        <w:t xml:space="preserve">, що створює так звану системну групу.</w:t>
+        <w:t xml:space="preserve">Для створення нових груп користувачів в операційній системі Linux використовується команда groupadd. Щоб створити стандартну групу, достатньо ввести цю команду, за якою вказати бажану назву групи. Якщо виникає потреба задати конкретний числовий ідентифікатор групи (Group ID або GID), до команди додається спеціальна опція -g із відповідним числом. У випадках, коли створюється група для системних потреб або сервісів, які зазвичай мають нижчі GID, застосовується опція -r, що створює так звану системну групу.</w:t>
       </w:r>
     </w:p>
     <w:p>
@@ -1067,43 +1005,7 @@
           <w:szCs w:val="28"/>
           <w:rtl w:val="0"/>
         </w:rPr>
-        <w:t xml:space="preserve">Для зміни параметрів самої групи використовується команда groupmod. Ця команда дозволяє адміністратору коригувати метадані групи. Наприклад, щоб перейменувати групу, слід використати опцію </w:t>
-      </w:r>
-      <w:r>
-        <w:rPr>
-          <w:rFonts w:ascii="Times New Roman" w:cs="Times New Roman" w:eastAsia="Times New Roman" w:hAnsi="Times New Roman"/>
-          <w:sz w:val="28"/>
-          <w:szCs w:val="28"/>
-          <w:rtl w:val="0"/>
-        </w:rPr>
-        <w:t xml:space="preserve">-n</w:t>
-      </w:r>
-      <w:r>
-        <w:rPr>
-          <w:rFonts w:ascii="Times New Roman" w:cs="Times New Roman" w:eastAsia="Times New Roman" w:hAnsi="Times New Roman"/>
-          <w:sz w:val="28"/>
-          <w:szCs w:val="28"/>
-          <w:rtl w:val="0"/>
-        </w:rPr>
-        <w:t xml:space="preserve">, вказавши спочатку нове ім'я, а потім старе ім'я групи. Якщо необхідно змінити числовий ідентифікатор групи, застосовується опція </w:t>
-      </w:r>
-      <w:r>
-        <w:rPr>
-          <w:rFonts w:ascii="Times New Roman" w:cs="Times New Roman" w:eastAsia="Times New Roman" w:hAnsi="Times New Roman"/>
-          <w:sz w:val="28"/>
-          <w:szCs w:val="28"/>
-          <w:rtl w:val="0"/>
-        </w:rPr>
-        <w:t xml:space="preserve">-g</w:t>
-      </w:r>
-      <w:r>
-        <w:rPr>
-          <w:rFonts w:ascii="Times New Roman" w:cs="Times New Roman" w:eastAsia="Times New Roman" w:hAnsi="Times New Roman"/>
-          <w:sz w:val="28"/>
-          <w:szCs w:val="28"/>
-          <w:rtl w:val="0"/>
-        </w:rPr>
-        <w:t xml:space="preserve"> із новим GID.</w:t>
+        <w:t xml:space="preserve">Для зміни параметрів самої групи використовується команда groupmod. Ця команда дозволяє адміністратору коригувати метадані групи. Наприклад, щоб перейменувати групу, слід використати опцію -n, вказавши спочатку нове ім'я, а потім старе ім'я групи. Якщо необхідно змінити числовий ідентифікатор групи, застосовується опція -g із новим GID.</w:t>
       </w:r>
     </w:p>
     <w:p>
@@ -1123,61 +1025,7 @@
           <w:szCs w:val="28"/>
           <w:rtl w:val="0"/>
         </w:rPr>
-        <w:t xml:space="preserve">Важливо пам'ятати, що для додавання або вилучення користувачів зі складу групи використовуються інші команди, такі як </w:t>
-      </w:r>
-      <w:r>
-        <w:rPr>
-          <w:rFonts w:ascii="Times New Roman" w:cs="Times New Roman" w:eastAsia="Times New Roman" w:hAnsi="Times New Roman"/>
-          <w:sz w:val="28"/>
-          <w:szCs w:val="28"/>
-          <w:rtl w:val="0"/>
-        </w:rPr>
-        <w:t xml:space="preserve">usermod</w:t>
-      </w:r>
-      <w:r>
-        <w:rPr>
-          <w:rFonts w:ascii="Times New Roman" w:cs="Times New Roman" w:eastAsia="Times New Roman" w:hAnsi="Times New Roman"/>
-          <w:sz w:val="28"/>
-          <w:szCs w:val="28"/>
-          <w:rtl w:val="0"/>
-        </w:rPr>
-        <w:t xml:space="preserve"> або </w:t>
-      </w:r>
-      <w:r>
-        <w:rPr>
-          <w:rFonts w:ascii="Times New Roman" w:cs="Times New Roman" w:eastAsia="Times New Roman" w:hAnsi="Times New Roman"/>
-          <w:sz w:val="28"/>
-          <w:szCs w:val="28"/>
-          <w:rtl w:val="0"/>
-        </w:rPr>
-        <w:t xml:space="preserve">gpasswd</w:t>
-      </w:r>
-      <w:r>
-        <w:rPr>
-          <w:rFonts w:ascii="Times New Roman" w:cs="Times New Roman" w:eastAsia="Times New Roman" w:hAnsi="Times New Roman"/>
-          <w:sz w:val="28"/>
-          <w:szCs w:val="28"/>
-          <w:rtl w:val="0"/>
-        </w:rPr>
-        <w:t xml:space="preserve">, а не </w:t>
-      </w:r>
-      <w:r>
-        <w:rPr>
-          <w:rFonts w:ascii="Times New Roman" w:cs="Times New Roman" w:eastAsia="Times New Roman" w:hAnsi="Times New Roman"/>
-          <w:sz w:val="28"/>
-          <w:szCs w:val="28"/>
-          <w:rtl w:val="0"/>
-        </w:rPr>
-        <w:t xml:space="preserve">groupmod</w:t>
-      </w:r>
-      <w:r>
-        <w:rPr>
-          <w:rFonts w:ascii="Times New Roman" w:cs="Times New Roman" w:eastAsia="Times New Roman" w:hAnsi="Times New Roman"/>
-          <w:sz w:val="28"/>
-          <w:szCs w:val="28"/>
-          <w:rtl w:val="0"/>
-        </w:rPr>
-        <w:t xml:space="preserve">, яка призначена саме для зміни основних налаштувань групи.</w:t>
+        <w:t xml:space="preserve">Важливо пам'ятати, що для додавання або вилучення користувачів зі складу групи використовуються інші команди, такі як usermod або gpasswd, а не groupmod, яка призначена саме для зміни основних налаштувань групи.</w:t>
       </w:r>
     </w:p>
     <w:p>
@@ -1359,7 +1207,7 @@
       <w:pPr>
         <w:numPr>
           <w:ilvl w:val="1"/>
-          <w:numId w:val="2"/>
+          <w:numId w:val="3"/>
         </w:numPr>
         <w:spacing w:line="240" w:lineRule="auto"/>
         <w:ind w:left="993" w:hanging="426"/>
@@ -1401,17 +1249,12 @@
         </w:rPr>
         <w:t xml:space="preserve">.</w:t>
       </w:r>
-      <w:r>
-        <w:rPr>
-          <w:rtl w:val="0"/>
-        </w:rPr>
-      </w:r>
     </w:p>
     <w:p>
       <w:pPr>
         <w:numPr>
           <w:ilvl w:val="1"/>
-          <w:numId w:val="2"/>
+          <w:numId w:val="3"/>
         </w:numPr>
         <w:spacing w:line="240" w:lineRule="auto"/>
         <w:ind w:left="993" w:hanging="426"/>
@@ -1453,17 +1296,12 @@
         </w:rPr>
         <w:t xml:space="preserve"> </w:t>
       </w:r>
-      <w:r>
-        <w:rPr>
-          <w:rtl w:val="0"/>
-        </w:rPr>
-      </w:r>
     </w:p>
     <w:p>
       <w:pPr>
         <w:numPr>
           <w:ilvl w:val="1"/>
-          <w:numId w:val="2"/>
+          <w:numId w:val="3"/>
         </w:numPr>
         <w:spacing w:line="240" w:lineRule="auto"/>
         <w:ind w:left="993" w:hanging="426"/>
@@ -1504,11 +1342,6 @@
           <w:rtl w:val="0"/>
         </w:rPr>
         <w:t xml:space="preserve"> та запустіть термінал.</w:t>
-      </w:r>
-      <w:r>
-        <w:rPr>
-          <w:rtl w:val="0"/>
-        </w:rPr>
       </w:r>
     </w:p>
     <w:p>
@@ -2052,7 +1885,7 @@
       <w:pPr>
         <w:numPr>
           <w:ilvl w:val="0"/>
-          <w:numId w:val="3"/>
+          <w:numId w:val="1"/>
         </w:numPr>
         <w:spacing w:line="240" w:lineRule="auto"/>
         <w:ind w:left="1004" w:hanging="360"/>
@@ -2075,332 +1908,145 @@
     </w:p>
     <w:p>
       <w:pPr>
-        <w:numPr>
-          <w:ilvl w:val="0"/>
-          <w:numId w:val="3"/>
-        </w:numPr>
-        <w:spacing w:line="240" w:lineRule="auto"/>
-        <w:ind w:left="1004" w:hanging="360"/>
-        <w:jc w:val="both"/>
-        <w:rPr>
-          <w:rFonts w:ascii="Times New Roman" w:cs="Times New Roman" w:eastAsia="Times New Roman" w:hAnsi="Times New Roman"/>
-          <w:sz w:val="28"/>
-          <w:szCs w:val="28"/>
-        </w:rPr>
-      </w:pPr>
-      <w:r>
-        <w:rPr>
-          <w:rFonts w:ascii="Times New Roman" w:cs="Times New Roman" w:eastAsia="Times New Roman" w:hAnsi="Times New Roman"/>
-          <w:sz w:val="28"/>
-          <w:szCs w:val="28"/>
-          <w:rtl w:val="0"/>
-        </w:rPr>
-        <w:t xml:space="preserve">*попрактикуйте в терміналі команди last, w та who. Порівняйте результати виводу кожної команди, які деталі відсутні в кожній із команд порівняно з іншими?</w:t>
-      </w:r>
-    </w:p>
-    <w:p>
-      <w:pPr>
-        <w:numPr>
-          <w:ilvl w:val="0"/>
-          <w:numId w:val="3"/>
-        </w:numPr>
-        <w:spacing w:line="240" w:lineRule="auto"/>
-        <w:ind w:left="1004" w:hanging="360"/>
-        <w:jc w:val="both"/>
-        <w:rPr>
-          <w:rFonts w:ascii="Times New Roman" w:cs="Times New Roman" w:eastAsia="Times New Roman" w:hAnsi="Times New Roman"/>
-          <w:sz w:val="28"/>
-          <w:szCs w:val="28"/>
-        </w:rPr>
-      </w:pPr>
-      <w:r>
-        <w:rPr>
-          <w:rFonts w:ascii="Times New Roman" w:cs="Times New Roman" w:eastAsia="Times New Roman" w:hAnsi="Times New Roman"/>
-          <w:sz w:val="28"/>
-          <w:szCs w:val="28"/>
-          <w:rtl w:val="0"/>
-        </w:rPr>
-        <w:t xml:space="preserve">*створіть дві нові групи користувачів - super_admins, noob_users та good_students, визначте їх ідентифікатори;</w:t>
-      </w:r>
-    </w:p>
-    <w:p>
-      <w:pPr>
-        <w:numPr>
-          <w:ilvl w:val="0"/>
-          <w:numId w:val="3"/>
-        </w:numPr>
-        <w:spacing w:line="240" w:lineRule="auto"/>
-        <w:ind w:left="1004" w:hanging="360"/>
-        <w:jc w:val="both"/>
-        <w:rPr>
-          <w:rFonts w:ascii="Times New Roman" w:cs="Times New Roman" w:eastAsia="Times New Roman" w:hAnsi="Times New Roman"/>
-          <w:sz w:val="28"/>
-          <w:szCs w:val="28"/>
-        </w:rPr>
-      </w:pPr>
-      <w:r>
-        <w:rPr>
-          <w:rFonts w:ascii="Times New Roman" w:cs="Times New Roman" w:eastAsia="Times New Roman" w:hAnsi="Times New Roman"/>
-          <w:sz w:val="28"/>
-          <w:szCs w:val="28"/>
-          <w:rtl w:val="0"/>
-        </w:rPr>
-        <w:t xml:space="preserve">*для кожного члену Вашої команди за допомогою терміналу створіть нового користувача (якщо працюєте самі, то просто трьох довільних користувачів), не забудьте після створення нового користувача одразу задати йому пароль;</w:t>
-      </w:r>
-    </w:p>
-    <w:p>
-      <w:pPr>
-        <w:numPr>
-          <w:ilvl w:val="0"/>
-          <w:numId w:val="3"/>
-        </w:numPr>
-        <w:spacing w:line="240" w:lineRule="auto"/>
-        <w:ind w:left="1004" w:hanging="360"/>
-        <w:jc w:val="both"/>
-        <w:rPr>
-          <w:rFonts w:ascii="Times New Roman" w:cs="Times New Roman" w:eastAsia="Times New Roman" w:hAnsi="Times New Roman"/>
-          <w:color w:val="ff0000"/>
-          <w:sz w:val="28"/>
-          <w:szCs w:val="28"/>
-        </w:rPr>
-      </w:pPr>
-      <w:r>
-        <w:rPr>
-          <w:rFonts w:ascii="Times New Roman" w:cs="Times New Roman" w:eastAsia="Times New Roman" w:hAnsi="Times New Roman"/>
-          <w:sz w:val="28"/>
-          <w:szCs w:val="28"/>
-          <w:rtl w:val="0"/>
-        </w:rPr>
-        <w:t xml:space="preserve">**додайте нових користувачів у створені Вами нові групи таким чином, щоб у групах super_admins та noob_users було по 2 користувачі, один з яких є в обох групах, у групу good_students додайте всіх трьох користувачів;</w:t>
-      </w:r>
-    </w:p>
-    <w:p>
-      <w:pPr>
-        <w:numPr>
-          <w:ilvl w:val="0"/>
-          <w:numId w:val="3"/>
-        </w:numPr>
-        <w:spacing w:line="240" w:lineRule="auto"/>
-        <w:ind w:left="1004" w:hanging="360"/>
-        <w:jc w:val="both"/>
-        <w:rPr>
-          <w:rFonts w:ascii="Times New Roman" w:cs="Times New Roman" w:eastAsia="Times New Roman" w:hAnsi="Times New Roman"/>
-          <w:sz w:val="28"/>
-          <w:szCs w:val="28"/>
-        </w:rPr>
-      </w:pPr>
-      <w:r>
-        <w:rPr>
-          <w:rFonts w:ascii="Times New Roman" w:cs="Times New Roman" w:eastAsia="Times New Roman" w:hAnsi="Times New Roman"/>
-          <w:sz w:val="28"/>
-          <w:szCs w:val="28"/>
-          <w:rtl w:val="0"/>
-        </w:rPr>
-        <w:t xml:space="preserve">**перегляньте інформацію про групи, та які користувачі до них входять, поясніть що ви бачите;</w:t>
-      </w:r>
-    </w:p>
-    <w:p>
-      <w:pPr>
-        <w:numPr>
-          <w:ilvl w:val="0"/>
-          <w:numId w:val="3"/>
-        </w:numPr>
-        <w:spacing w:line="240" w:lineRule="auto"/>
-        <w:ind w:left="1004" w:hanging="360"/>
-        <w:jc w:val="both"/>
-        <w:rPr>
-          <w:rFonts w:ascii="Times New Roman" w:cs="Times New Roman" w:eastAsia="Times New Roman" w:hAnsi="Times New Roman"/>
-          <w:sz w:val="28"/>
-          <w:szCs w:val="28"/>
-        </w:rPr>
-      </w:pPr>
-      <w:r>
-        <w:rPr>
-          <w:rFonts w:ascii="Times New Roman" w:cs="Times New Roman" w:eastAsia="Times New Roman" w:hAnsi="Times New Roman"/>
-          <w:sz w:val="28"/>
-          <w:szCs w:val="28"/>
-          <w:rtl w:val="0"/>
-        </w:rPr>
-        <w:t xml:space="preserve">**видаліть першого створеного вами користувача, перегляньте чи залишиться інформація про нього в групах, де він перебував;</w:t>
-      </w:r>
-    </w:p>
-    <w:p>
-      <w:pPr>
-        <w:numPr>
-          <w:ilvl w:val="0"/>
-          <w:numId w:val="3"/>
-        </w:numPr>
-        <w:spacing w:line="240" w:lineRule="auto"/>
-        <w:ind w:left="1004" w:hanging="360"/>
-        <w:jc w:val="both"/>
-        <w:rPr>
-          <w:rFonts w:ascii="Times New Roman" w:cs="Times New Roman" w:eastAsia="Times New Roman" w:hAnsi="Times New Roman"/>
-          <w:sz w:val="28"/>
-          <w:szCs w:val="28"/>
-        </w:rPr>
-      </w:pPr>
-      <w:r>
-        <w:rPr>
-          <w:rFonts w:ascii="Times New Roman" w:cs="Times New Roman" w:eastAsia="Times New Roman" w:hAnsi="Times New Roman"/>
-          <w:sz w:val="28"/>
-          <w:szCs w:val="28"/>
-          <w:rtl w:val="0"/>
-        </w:rPr>
-        <w:t xml:space="preserve">**видаліть другого користувача, перегляньте чи залишиться інформація про нього в групах, де він перебував; </w:t>
-      </w:r>
-    </w:p>
-    <w:p>
-      <w:pPr>
-        <w:numPr>
-          <w:ilvl w:val="0"/>
-          <w:numId w:val="3"/>
-        </w:numPr>
-        <w:spacing w:line="240" w:lineRule="auto"/>
-        <w:ind w:left="1004" w:hanging="360"/>
-        <w:jc w:val="both"/>
-        <w:rPr>
-          <w:rFonts w:ascii="Times New Roman" w:cs="Times New Roman" w:eastAsia="Times New Roman" w:hAnsi="Times New Roman"/>
-          <w:color w:val="ff0000"/>
-          <w:sz w:val="28"/>
-          <w:szCs w:val="28"/>
-        </w:rPr>
-      </w:pPr>
-      <w:r>
-        <w:rPr>
-          <w:rFonts w:ascii="Times New Roman" w:cs="Times New Roman" w:eastAsia="Times New Roman" w:hAnsi="Times New Roman"/>
-          <w:sz w:val="28"/>
-          <w:szCs w:val="28"/>
-          <w:rtl w:val="0"/>
-        </w:rPr>
-        <w:t xml:space="preserve">**видаліть третього користувача, перегляньте чи залишиться інформація про нього в групах, де він перебував; </w:t>
-      </w:r>
-      <w:r>
-        <w:rPr>
-          <w:rtl w:val="0"/>
-        </w:rPr>
-      </w:r>
-    </w:p>
-    <w:p>
-      <w:pPr>
-        <w:numPr>
-          <w:ilvl w:val="0"/>
-          <w:numId w:val="3"/>
-        </w:numPr>
-        <w:spacing w:line="240" w:lineRule="auto"/>
-        <w:ind w:left="1004" w:hanging="360"/>
-        <w:jc w:val="both"/>
-        <w:rPr>
-          <w:rFonts w:ascii="Times New Roman" w:cs="Times New Roman" w:eastAsia="Times New Roman" w:hAnsi="Times New Roman"/>
-          <w:sz w:val="28"/>
-          <w:szCs w:val="28"/>
-        </w:rPr>
-      </w:pPr>
-      <w:r>
-        <w:rPr>
-          <w:rFonts w:ascii="Times New Roman" w:cs="Times New Roman" w:eastAsia="Times New Roman" w:hAnsi="Times New Roman"/>
-          <w:sz w:val="28"/>
-          <w:szCs w:val="28"/>
-          <w:rtl w:val="0"/>
-        </w:rPr>
-        <w:t xml:space="preserve">**перегляньте інформацію про існуючі групи користувачів;</w:t>
-      </w:r>
-    </w:p>
-    <w:p>
-      <w:pPr>
-        <w:numPr>
-          <w:ilvl w:val="0"/>
-          <w:numId w:val="3"/>
-        </w:numPr>
-        <w:spacing w:line="240" w:lineRule="auto"/>
-        <w:ind w:left="1004" w:hanging="360"/>
-        <w:jc w:val="both"/>
-        <w:rPr>
-          <w:rFonts w:ascii="Times New Roman" w:cs="Times New Roman" w:eastAsia="Times New Roman" w:hAnsi="Times New Roman"/>
-          <w:sz w:val="28"/>
-          <w:szCs w:val="28"/>
-        </w:rPr>
-      </w:pPr>
-      <w:r>
-        <w:rPr>
-          <w:rFonts w:ascii="Times New Roman" w:cs="Times New Roman" w:eastAsia="Times New Roman" w:hAnsi="Times New Roman"/>
-          <w:sz w:val="28"/>
-          <w:szCs w:val="28"/>
-          <w:rtl w:val="0"/>
-        </w:rPr>
-        <w:t xml:space="preserve">**видаліть створені Вами групи користувачів;</w:t>
-      </w:r>
-    </w:p>
-    <w:p>
-      <w:pPr>
-        <w:numPr>
-          <w:ilvl w:val="0"/>
-          <w:numId w:val="3"/>
-        </w:numPr>
-        <w:spacing w:line="240" w:lineRule="auto"/>
-        <w:ind w:left="1004" w:hanging="360"/>
-        <w:jc w:val="both"/>
-        <w:rPr>
-          <w:rFonts w:ascii="Times New Roman" w:cs="Times New Roman" w:eastAsia="Times New Roman" w:hAnsi="Times New Roman"/>
-          <w:sz w:val="28"/>
-          <w:szCs w:val="28"/>
-        </w:rPr>
-      </w:pPr>
-      <w:r>
-        <w:rPr>
-          <w:rFonts w:ascii="Times New Roman" w:cs="Times New Roman" w:eastAsia="Times New Roman" w:hAnsi="Times New Roman"/>
-          <w:sz w:val="28"/>
-          <w:szCs w:val="28"/>
-          <w:rtl w:val="0"/>
-        </w:rPr>
-        <w:t xml:space="preserve">**перегляньте інформацію про існуючі групи користувачів.</w:t>
-      </w:r>
-    </w:p>
-    <w:p>
-      <w:pPr>
-        <w:tabs>
-          <w:tab w:val="left" w:leader="none" w:pos="993"/>
-        </w:tabs>
-        <w:spacing w:line="240" w:lineRule="auto"/>
-        <w:ind w:left="567" w:firstLine="0"/>
-        <w:jc w:val="both"/>
-        <w:rPr>
-          <w:rFonts w:ascii="Times New Roman" w:cs="Times New Roman" w:eastAsia="Times New Roman" w:hAnsi="Times New Roman"/>
-          <w:sz w:val="28"/>
-          <w:szCs w:val="28"/>
-        </w:rPr>
-      </w:pPr>
-      <w:r>
-        <w:rPr>
-          <w:rFonts w:ascii="Times New Roman" w:cs="Times New Roman" w:eastAsia="Times New Roman" w:hAnsi="Times New Roman"/>
-          <w:sz w:val="28"/>
-          <w:szCs w:val="28"/>
-          <w:rtl w:val="0"/>
-        </w:rPr>
-        <w:t xml:space="preserve"> </w:t>
-      </w:r>
-    </w:p>
-    <w:p>
-      <w:pPr>
-        <w:spacing w:line="240" w:lineRule="auto"/>
-        <w:jc w:val="both"/>
-        <w:rPr>
-          <w:rFonts w:ascii="Times New Roman" w:cs="Times New Roman" w:eastAsia="Times New Roman" w:hAnsi="Times New Roman"/>
-          <w:b w:val="1"/>
-          <w:bCs w:val="1"/>
-          <w:sz w:val="28"/>
-          <w:szCs w:val="28"/>
-        </w:rPr>
-      </w:pPr>
-      <w:r>
-        <w:rPr>
-          <w:rFonts w:ascii="Times New Roman" w:cs="Times New Roman" w:eastAsia="Times New Roman" w:hAnsi="Times New Roman"/>
-          <w:b w:val="1"/>
-          <w:bCs w:val="1"/>
-          <w:sz w:val="28"/>
-          <w:szCs w:val="28"/>
-          <w:rtl w:val="0"/>
-        </w:rPr>
-        <w:t xml:space="preserve">Контрольні запитання:</w:t>
+        <w:spacing w:line="240" w:lineRule="auto"/>
+        <w:ind w:left="1004" w:firstLine="0"/>
+        <w:jc w:val="both"/>
+        <w:rPr>
+          <w:rFonts w:ascii="Times New Roman" w:cs="Times New Roman" w:eastAsia="Times New Roman" w:hAnsi="Times New Roman"/>
+          <w:sz w:val="28"/>
+          <w:szCs w:val="28"/>
+        </w:rPr>
+      </w:pPr>
+      <w:r>
+        <w:rPr>
+          <w:rtl w:val="0"/>
+        </w:rPr>
+      </w:r>
+    </w:p>
+    <w:p>
+      <w:pPr>
+        <w:spacing w:line="240" w:lineRule="auto"/>
+        <w:jc w:val="both"/>
+        <w:rPr>
+          <w:rFonts w:ascii="Times New Roman" w:cs="Times New Roman" w:eastAsia="Times New Roman" w:hAnsi="Times New Roman"/>
+          <w:sz w:val="28"/>
+          <w:szCs w:val="28"/>
+        </w:rPr>
+      </w:pPr>
+      <w:r>
+        <w:rPr>
+          <w:rFonts w:ascii="Times New Roman" w:cs="Times New Roman" w:eastAsia="Times New Roman" w:hAnsi="Times New Roman"/>
+          <w:sz w:val="28"/>
+          <w:szCs w:val="28"/>
+        </w:rPr>
+        <w:drawing>
+          <wp:inline distB="114300" distT="114300" distL="114300" distR="114300">
+            <wp:extent cx="5731200" cy="215900"/>
+            <wp:effectExtent b="0" l="0" r="0" t="0"/>
+            <wp:docPr id="14" name="image20.png"/>
+            <a:graphic>
+              <a:graphicData uri="http://schemas.openxmlformats.org/drawingml/2006/picture">
+                <pic:pic>
+                  <pic:nvPicPr>
+                    <pic:cNvPr id="0" name="image20.png"/>
+                    <pic:cNvPicPr preferRelativeResize="0"/>
+                  </pic:nvPicPr>
+                  <pic:blipFill>
+                    <a:blip r:embed="rId6"/>
+                    <a:srcRect b="0" l="0" r="0" t="0"/>
+                    <a:stretch>
+                      <a:fillRect/>
+                    </a:stretch>
+                  </pic:blipFill>
+                  <pic:spPr>
+                    <a:xfrm>
+                      <a:off x="0" y="0"/>
+                      <a:ext cx="5731200" cy="215900"/>
+                    </a:xfrm>
+                    <a:prstGeom prst="rect"/>
+                    <a:ln/>
+                  </pic:spPr>
+                </pic:pic>
+              </a:graphicData>
+            </a:graphic>
+          </wp:inline>
+        </w:drawing>
+      </w:r>
+      <w:r>
+        <w:rPr>
+          <w:rtl w:val="0"/>
+        </w:rPr>
+      </w:r>
+    </w:p>
+    <w:p>
+      <w:pPr>
+        <w:spacing w:line="240" w:lineRule="auto"/>
+        <w:jc w:val="both"/>
+        <w:rPr>
+          <w:rFonts w:ascii="Times New Roman" w:cs="Times New Roman" w:eastAsia="Times New Roman" w:hAnsi="Times New Roman"/>
+          <w:sz w:val="28"/>
+          <w:szCs w:val="28"/>
+        </w:rPr>
+      </w:pPr>
+      <w:r>
+        <w:rPr>
+          <w:rFonts w:ascii="Times New Roman" w:cs="Times New Roman" w:eastAsia="Times New Roman" w:hAnsi="Times New Roman"/>
+          <w:sz w:val="28"/>
+          <w:szCs w:val="28"/>
+        </w:rPr>
+        <w:drawing>
+          <wp:inline distB="114300" distT="114300" distL="114300" distR="114300">
+            <wp:extent cx="5731200" cy="2133600"/>
+            <wp:effectExtent b="0" l="0" r="0" t="0"/>
+            <wp:docPr id="15" name="image9.png"/>
+            <a:graphic>
+              <a:graphicData uri="http://schemas.openxmlformats.org/drawingml/2006/picture">
+                <pic:pic>
+                  <pic:nvPicPr>
+                    <pic:cNvPr id="0" name="image9.png"/>
+                    <pic:cNvPicPr preferRelativeResize="0"/>
+                  </pic:nvPicPr>
+                  <pic:blipFill>
+                    <a:blip r:embed="rId7"/>
+                    <a:srcRect b="0" l="0" r="0" t="0"/>
+                    <a:stretch>
+                      <a:fillRect/>
+                    </a:stretch>
+                  </pic:blipFill>
+                  <pic:spPr>
+                    <a:xfrm>
+                      <a:off x="0" y="0"/>
+                      <a:ext cx="5731200" cy="2133600"/>
+                    </a:xfrm>
+                    <a:prstGeom prst="rect"/>
+                    <a:ln/>
+                  </pic:spPr>
+                </pic:pic>
+              </a:graphicData>
+            </a:graphic>
+          </wp:inline>
+        </w:drawing>
+      </w:r>
+      <w:r>
+        <w:rPr>
+          <w:rtl w:val="0"/>
+        </w:rPr>
+      </w:r>
+    </w:p>
+    <w:p>
+      <w:pPr>
+        <w:spacing w:line="240" w:lineRule="auto"/>
+        <w:jc w:val="both"/>
+        <w:rPr>
+          <w:rFonts w:ascii="Times New Roman" w:cs="Times New Roman" w:eastAsia="Times New Roman" w:hAnsi="Times New Roman"/>
+          <w:sz w:val="28"/>
+          <w:szCs w:val="28"/>
+        </w:rPr>
+      </w:pPr>
+      <w:r>
+        <w:rPr>
+          <w:rtl w:val="0"/>
+        </w:rPr>
       </w:r>
     </w:p>
     <w:p>
@@ -2410,58 +2056,132 @@
           <w:numId w:val="1"/>
         </w:numPr>
         <w:spacing w:line="240" w:lineRule="auto"/>
-        <w:ind w:left="709" w:hanging="349"/>
-        <w:jc w:val="both"/>
-        <w:rPr>
-          <w:rFonts w:ascii="Times New Roman" w:cs="Times New Roman" w:eastAsia="Times New Roman" w:hAnsi="Times New Roman"/>
-          <w:sz w:val="28"/>
-          <w:szCs w:val="28"/>
-        </w:rPr>
-      </w:pPr>
-      <w:r>
-        <w:rPr>
-          <w:rFonts w:ascii="Times New Roman" w:cs="Times New Roman" w:eastAsia="Times New Roman" w:hAnsi="Times New Roman"/>
-          <w:sz w:val="28"/>
-          <w:szCs w:val="28"/>
-          <w:rtl w:val="0"/>
-        </w:rPr>
-        <w:t xml:space="preserve">Чому в конфігураційних файлах паролі не зберігається в явному вигляді?</w:t>
-      </w:r>
-    </w:p>
-    <w:p>
-      <w:pPr>
-        <w:spacing w:line="240" w:lineRule="auto"/>
-        <w:jc w:val="both"/>
-        <w:rPr>
-          <w:rFonts w:ascii="Times New Roman" w:cs="Times New Roman" w:eastAsia="Times New Roman" w:hAnsi="Times New Roman"/>
-          <w:sz w:val="28"/>
-          <w:szCs w:val="28"/>
-        </w:rPr>
-      </w:pPr>
-      <w:r>
-        <w:rPr>
-          <w:rtl w:val="0"/>
-        </w:rPr>
-      </w:r>
-    </w:p>
-    <w:p>
-      <w:pPr>
-        <w:spacing w:line="240" w:lineRule="auto"/>
-        <w:jc w:val="both"/>
-        <w:rPr>
-          <w:rFonts w:ascii="Times New Roman" w:cs="Times New Roman" w:eastAsia="Times New Roman" w:hAnsi="Times New Roman"/>
-          <w:sz w:val="28"/>
-          <w:szCs w:val="28"/>
-        </w:rPr>
-      </w:pPr>
-      <w:r>
-        <w:rPr>
-          <w:rFonts w:ascii="Times New Roman" w:cs="Times New Roman" w:eastAsia="Times New Roman" w:hAnsi="Times New Roman"/>
-          <w:sz w:val="28"/>
-          <w:szCs w:val="28"/>
-          <w:rtl w:val="0"/>
-        </w:rPr>
-        <w:t xml:space="preserve">Паролі не зберігаються в явному вигляді для забезпечення безпеки. Якщо паролі зберігатимуться у відкритому вигляді, зловмисники, отримавши доступ до конфігураційних файлів, зможуть отримати паролі користувачів і зламати систему. Замість цього паролі зазвичай зберігаються у вигляді хешів, що є односторонніми функціями, які неможливо відновити до початкового значення безпеки</w:t>
+        <w:ind w:left="1004" w:hanging="360"/>
+        <w:jc w:val="both"/>
+        <w:rPr>
+          <w:rFonts w:ascii="Times New Roman" w:cs="Times New Roman" w:eastAsia="Times New Roman" w:hAnsi="Times New Roman"/>
+          <w:sz w:val="28"/>
+          <w:szCs w:val="28"/>
+        </w:rPr>
+      </w:pPr>
+      <w:r>
+        <w:rPr>
+          <w:rFonts w:ascii="Times New Roman" w:cs="Times New Roman" w:eastAsia="Times New Roman" w:hAnsi="Times New Roman"/>
+          <w:sz w:val="28"/>
+          <w:szCs w:val="28"/>
+          <w:rtl w:val="0"/>
+        </w:rPr>
+        <w:t xml:space="preserve">*попрактикуйте в терміналі команди last, w та who. Порівняйте результати виводу кожної команди, які деталі відсутні в кожній із команд порівняно з іншими?</w:t>
+      </w:r>
+    </w:p>
+    <w:p>
+      <w:pPr>
+        <w:spacing w:line="240" w:lineRule="auto"/>
+        <w:jc w:val="both"/>
+        <w:rPr>
+          <w:rFonts w:ascii="Times New Roman" w:cs="Times New Roman" w:eastAsia="Times New Roman" w:hAnsi="Times New Roman"/>
+          <w:sz w:val="28"/>
+          <w:szCs w:val="28"/>
+        </w:rPr>
+      </w:pPr>
+      <w:r>
+        <w:rPr>
+          <w:rFonts w:ascii="Times New Roman" w:cs="Times New Roman" w:eastAsia="Times New Roman" w:hAnsi="Times New Roman"/>
+          <w:sz w:val="28"/>
+          <w:szCs w:val="28"/>
+        </w:rPr>
+        <w:drawing>
+          <wp:inline distB="114300" distT="114300" distL="114300" distR="114300">
+            <wp:extent cx="5731200" cy="5156200"/>
+            <wp:effectExtent b="0" l="0" r="0" t="0"/>
+            <wp:docPr id="3" name="image14.png"/>
+            <a:graphic>
+              <a:graphicData uri="http://schemas.openxmlformats.org/drawingml/2006/picture">
+                <pic:pic>
+                  <pic:nvPicPr>
+                    <pic:cNvPr id="0" name="image14.png"/>
+                    <pic:cNvPicPr preferRelativeResize="0"/>
+                  </pic:nvPicPr>
+                  <pic:blipFill>
+                    <a:blip r:embed="rId8"/>
+                    <a:srcRect b="0" l="0" r="0" t="0"/>
+                    <a:stretch>
+                      <a:fillRect/>
+                    </a:stretch>
+                  </pic:blipFill>
+                  <pic:spPr>
+                    <a:xfrm>
+                      <a:off x="0" y="0"/>
+                      <a:ext cx="5731200" cy="5156200"/>
+                    </a:xfrm>
+                    <a:prstGeom prst="rect"/>
+                    <a:ln/>
+                  </pic:spPr>
+                </pic:pic>
+              </a:graphicData>
+            </a:graphic>
+          </wp:inline>
+        </w:drawing>
+      </w:r>
+      <w:r>
+        <w:rPr>
+          <w:rtl w:val="0"/>
+        </w:rPr>
+      </w:r>
+    </w:p>
+    <w:p>
+      <w:pPr>
+        <w:spacing w:line="240" w:lineRule="auto"/>
+        <w:jc w:val="both"/>
+        <w:rPr>
+          <w:rFonts w:ascii="Times New Roman" w:cs="Times New Roman" w:eastAsia="Times New Roman" w:hAnsi="Times New Roman"/>
+          <w:sz w:val="28"/>
+          <w:szCs w:val="28"/>
+        </w:rPr>
+      </w:pPr>
+      <w:r>
+        <w:rPr>
+          <w:rFonts w:ascii="Times New Roman" w:cs="Times New Roman" w:eastAsia="Times New Roman" w:hAnsi="Times New Roman"/>
+          <w:sz w:val="28"/>
+          <w:szCs w:val="28"/>
+        </w:rPr>
+        <w:drawing>
+          <wp:inline distB="114300" distT="114300" distL="114300" distR="114300">
+            <wp:extent cx="5731200" cy="838200"/>
+            <wp:effectExtent b="0" l="0" r="0" t="0"/>
+            <wp:docPr id="19" name="image4.png"/>
+            <a:graphic>
+              <a:graphicData uri="http://schemas.openxmlformats.org/drawingml/2006/picture">
+                <pic:pic>
+                  <pic:nvPicPr>
+                    <pic:cNvPr id="0" name="image4.png"/>
+                    <pic:cNvPicPr preferRelativeResize="0"/>
+                  </pic:nvPicPr>
+                  <pic:blipFill>
+                    <a:blip r:embed="rId9"/>
+                    <a:srcRect b="0" l="0" r="0" t="0"/>
+                    <a:stretch>
+                      <a:fillRect/>
+                    </a:stretch>
+                  </pic:blipFill>
+                  <pic:spPr>
+                    <a:xfrm>
+                      <a:off x="0" y="0"/>
+                      <a:ext cx="5731200" cy="838200"/>
+                    </a:xfrm>
+                    <a:prstGeom prst="rect"/>
+                    <a:ln/>
+                  </pic:spPr>
+                </pic:pic>
+              </a:graphicData>
+            </a:graphic>
+          </wp:inline>
+        </w:drawing>
+      </w:r>
+      <w:r>
+        <w:rPr>
+          <w:rtl w:val="0"/>
+        </w:rPr>
       </w:r>
     </w:p>
     <w:p>
@@ -2487,58 +2207,188 @@
           <w:numId w:val="1"/>
         </w:numPr>
         <w:spacing w:line="240" w:lineRule="auto"/>
-        <w:ind w:left="709" w:hanging="349"/>
-        <w:jc w:val="both"/>
-        <w:rPr>
-          <w:rFonts w:ascii="Times New Roman" w:cs="Times New Roman" w:eastAsia="Times New Roman" w:hAnsi="Times New Roman"/>
-          <w:sz w:val="28"/>
-          <w:szCs w:val="28"/>
-        </w:rPr>
-      </w:pPr>
-      <w:r>
-        <w:rPr>
-          <w:rFonts w:ascii="Times New Roman" w:cs="Times New Roman" w:eastAsia="Times New Roman" w:hAnsi="Times New Roman"/>
-          <w:sz w:val="28"/>
-          <w:szCs w:val="28"/>
-          <w:rtl w:val="0"/>
-        </w:rPr>
-        <w:t xml:space="preserve">Чому не рекомендується виконувати повсякденні операції, використовуючи обліковий запис root?</w:t>
-      </w:r>
-    </w:p>
-    <w:p>
-      <w:pPr>
-        <w:spacing w:line="240" w:lineRule="auto"/>
-        <w:jc w:val="both"/>
-        <w:rPr>
-          <w:rFonts w:ascii="Times New Roman" w:cs="Times New Roman" w:eastAsia="Times New Roman" w:hAnsi="Times New Roman"/>
-          <w:sz w:val="28"/>
-          <w:szCs w:val="28"/>
-        </w:rPr>
-      </w:pPr>
-      <w:r>
-        <w:rPr>
-          <w:rtl w:val="0"/>
-        </w:rPr>
-      </w:r>
-    </w:p>
-    <w:p>
-      <w:pPr>
-        <w:spacing w:line="240" w:lineRule="auto"/>
-        <w:jc w:val="both"/>
-        <w:rPr>
-          <w:rFonts w:ascii="Times New Roman" w:cs="Times New Roman" w:eastAsia="Times New Roman" w:hAnsi="Times New Roman"/>
-          <w:sz w:val="28"/>
-          <w:szCs w:val="28"/>
-        </w:rPr>
-      </w:pPr>
-      <w:r>
-        <w:rPr>
-          <w:rFonts w:ascii="Times New Roman" w:cs="Times New Roman" w:eastAsia="Times New Roman" w:hAnsi="Times New Roman"/>
-          <w:sz w:val="28"/>
-          <w:szCs w:val="28"/>
-          <w:rtl w:val="0"/>
-        </w:rPr>
-        <w:t xml:space="preserve">Використання облікового запису root для повсякденних операцій небезпечне, оскільки цей користувач має необмежені права на систему. Будь-яка помилка, виконана від імені root, може призвести до серйозних наслідків, таких як випадкове видалення важливих файлів або порушення безпеки. Краще використовувати менш привілейовані облікові записи для повсякденних завдань і застосовувати права root лише в разі необхідності, через команди на зразок sudo. </w:t>
+        <w:ind w:left="1004" w:hanging="360"/>
+        <w:jc w:val="both"/>
+        <w:rPr>
+          <w:rFonts w:ascii="Times New Roman" w:cs="Times New Roman" w:eastAsia="Times New Roman" w:hAnsi="Times New Roman"/>
+          <w:sz w:val="28"/>
+          <w:szCs w:val="28"/>
+        </w:rPr>
+      </w:pPr>
+      <w:r>
+        <w:rPr>
+          <w:rFonts w:ascii="Times New Roman" w:cs="Times New Roman" w:eastAsia="Times New Roman" w:hAnsi="Times New Roman"/>
+          <w:sz w:val="28"/>
+          <w:szCs w:val="28"/>
+          <w:rtl w:val="0"/>
+        </w:rPr>
+        <w:t xml:space="preserve">*створіть дві нові групи користувачів - super_admins, noob_users та good_students, визначте їх ідентифікатори;</w:t>
+      </w:r>
+    </w:p>
+    <w:p>
+      <w:pPr>
+        <w:spacing w:line="240" w:lineRule="auto"/>
+        <w:ind w:left="1004" w:firstLine="0"/>
+        <w:jc w:val="both"/>
+        <w:rPr>
+          <w:rFonts w:ascii="Times New Roman" w:cs="Times New Roman" w:eastAsia="Times New Roman" w:hAnsi="Times New Roman"/>
+          <w:sz w:val="28"/>
+          <w:szCs w:val="28"/>
+        </w:rPr>
+      </w:pPr>
+      <w:r>
+        <w:rPr>
+          <w:rtl w:val="0"/>
+        </w:rPr>
+      </w:r>
+    </w:p>
+    <w:p>
+      <w:pPr>
+        <w:spacing w:line="240" w:lineRule="auto"/>
+        <w:jc w:val="both"/>
+        <w:rPr>
+          <w:rFonts w:ascii="Times New Roman" w:cs="Times New Roman" w:eastAsia="Times New Roman" w:hAnsi="Times New Roman"/>
+          <w:sz w:val="28"/>
+          <w:szCs w:val="28"/>
+        </w:rPr>
+      </w:pPr>
+      <w:r>
+        <w:rPr>
+          <w:rFonts w:ascii="Times New Roman" w:cs="Times New Roman" w:eastAsia="Times New Roman" w:hAnsi="Times New Roman"/>
+          <w:sz w:val="28"/>
+          <w:szCs w:val="28"/>
+        </w:rPr>
+        <w:drawing>
+          <wp:inline distB="114300" distT="114300" distL="114300" distR="114300">
+            <wp:extent cx="3743325" cy="533400"/>
+            <wp:effectExtent b="0" l="0" r="0" t="0"/>
+            <wp:docPr id="18" name="image18.png"/>
+            <a:graphic>
+              <a:graphicData uri="http://schemas.openxmlformats.org/drawingml/2006/picture">
+                <pic:pic>
+                  <pic:nvPicPr>
+                    <pic:cNvPr id="0" name="image18.png"/>
+                    <pic:cNvPicPr preferRelativeResize="0"/>
+                  </pic:nvPicPr>
+                  <pic:blipFill>
+                    <a:blip r:embed="rId10"/>
+                    <a:srcRect b="0" l="0" r="0" t="0"/>
+                    <a:stretch>
+                      <a:fillRect/>
+                    </a:stretch>
+                  </pic:blipFill>
+                  <pic:spPr>
+                    <a:xfrm>
+                      <a:off x="0" y="0"/>
+                      <a:ext cx="3743325" cy="533400"/>
+                    </a:xfrm>
+                    <a:prstGeom prst="rect"/>
+                    <a:ln/>
+                  </pic:spPr>
+                </pic:pic>
+              </a:graphicData>
+            </a:graphic>
+          </wp:inline>
+        </w:drawing>
+      </w:r>
+      <w:r>
+        <w:rPr>
+          <w:rtl w:val="0"/>
+        </w:rPr>
+      </w:r>
+    </w:p>
+    <w:p>
+      <w:pPr>
+        <w:spacing w:line="240" w:lineRule="auto"/>
+        <w:jc w:val="both"/>
+        <w:rPr>
+          <w:rFonts w:ascii="Times New Roman" w:cs="Times New Roman" w:eastAsia="Times New Roman" w:hAnsi="Times New Roman"/>
+          <w:sz w:val="28"/>
+          <w:szCs w:val="28"/>
+        </w:rPr>
+      </w:pPr>
+      <w:r>
+        <w:rPr>
+          <w:rFonts w:ascii="Times New Roman" w:cs="Times New Roman" w:eastAsia="Times New Roman" w:hAnsi="Times New Roman"/>
+          <w:sz w:val="28"/>
+          <w:szCs w:val="28"/>
+        </w:rPr>
+        <w:drawing>
+          <wp:inline distB="114300" distT="114300" distL="114300" distR="114300">
+            <wp:extent cx="3752850" cy="933450"/>
+            <wp:effectExtent b="0" l="0" r="0" t="0"/>
+            <wp:docPr id="9" name="image10.png"/>
+            <a:graphic>
+              <a:graphicData uri="http://schemas.openxmlformats.org/drawingml/2006/picture">
+                <pic:pic>
+                  <pic:nvPicPr>
+                    <pic:cNvPr id="0" name="image10.png"/>
+                    <pic:cNvPicPr preferRelativeResize="0"/>
+                  </pic:nvPicPr>
+                  <pic:blipFill>
+                    <a:blip r:embed="rId11"/>
+                    <a:srcRect b="0" l="0" r="0" t="0"/>
+                    <a:stretch>
+                      <a:fillRect/>
+                    </a:stretch>
+                  </pic:blipFill>
+                  <pic:spPr>
+                    <a:xfrm>
+                      <a:off x="0" y="0"/>
+                      <a:ext cx="3752850" cy="933450"/>
+                    </a:xfrm>
+                    <a:prstGeom prst="rect"/>
+                    <a:ln/>
+                  </pic:spPr>
+                </pic:pic>
+              </a:graphicData>
+            </a:graphic>
+          </wp:inline>
+        </w:drawing>
+      </w:r>
+      <w:r>
+        <w:rPr>
+          <w:rFonts w:ascii="Times New Roman" w:cs="Times New Roman" w:eastAsia="Times New Roman" w:hAnsi="Times New Roman"/>
+          <w:sz w:val="28"/>
+          <w:szCs w:val="28"/>
+        </w:rPr>
+        <w:drawing>
+          <wp:inline distB="114300" distT="114300" distL="114300" distR="114300">
+            <wp:extent cx="4000500" cy="714375"/>
+            <wp:effectExtent b="0" l="0" r="0" t="0"/>
+            <wp:docPr id="7" name="image13.png"/>
+            <a:graphic>
+              <a:graphicData uri="http://schemas.openxmlformats.org/drawingml/2006/picture">
+                <pic:pic>
+                  <pic:nvPicPr>
+                    <pic:cNvPr id="0" name="image13.png"/>
+                    <pic:cNvPicPr preferRelativeResize="0"/>
+                  </pic:nvPicPr>
+                  <pic:blipFill>
+                    <a:blip r:embed="rId12"/>
+                    <a:srcRect b="0" l="0" r="0" t="0"/>
+                    <a:stretch>
+                      <a:fillRect/>
+                    </a:stretch>
+                  </pic:blipFill>
+                  <pic:spPr>
+                    <a:xfrm>
+                      <a:off x="0" y="0"/>
+                      <a:ext cx="4000500" cy="714375"/>
+                    </a:xfrm>
+                    <a:prstGeom prst="rect"/>
+                    <a:ln/>
+                  </pic:spPr>
+                </pic:pic>
+              </a:graphicData>
+            </a:graphic>
+          </wp:inline>
+        </w:drawing>
+      </w:r>
+      <w:r>
+        <w:rPr>
+          <w:rtl w:val="0"/>
+        </w:rPr>
       </w:r>
     </w:p>
     <w:p>
@@ -2564,58 +2414,204 @@
           <w:numId w:val="1"/>
         </w:numPr>
         <w:spacing w:line="240" w:lineRule="auto"/>
-        <w:ind w:left="709" w:hanging="349"/>
-        <w:jc w:val="both"/>
-        <w:rPr>
-          <w:rFonts w:ascii="Times New Roman" w:cs="Times New Roman" w:eastAsia="Times New Roman" w:hAnsi="Times New Roman"/>
-          <w:sz w:val="28"/>
-          <w:szCs w:val="28"/>
-        </w:rPr>
-      </w:pPr>
-      <w:r>
-        <w:rPr>
-          <w:rFonts w:ascii="Times New Roman" w:cs="Times New Roman" w:eastAsia="Times New Roman" w:hAnsi="Times New Roman"/>
-          <w:sz w:val="28"/>
-          <w:szCs w:val="28"/>
-          <w:rtl w:val="0"/>
-        </w:rPr>
-        <w:t xml:space="preserve">*У чому відмінність механізмів отримання особливих привілеїв su і sudo?</w:t>
-      </w:r>
-    </w:p>
-    <w:p>
-      <w:pPr>
-        <w:spacing w:line="240" w:lineRule="auto"/>
-        <w:jc w:val="both"/>
-        <w:rPr>
-          <w:rFonts w:ascii="Times New Roman" w:cs="Times New Roman" w:eastAsia="Times New Roman" w:hAnsi="Times New Roman"/>
-          <w:sz w:val="28"/>
-          <w:szCs w:val="28"/>
-        </w:rPr>
-      </w:pPr>
-      <w:r>
-        <w:rPr>
-          <w:rtl w:val="0"/>
-        </w:rPr>
-      </w:r>
-    </w:p>
-    <w:p>
-      <w:pPr>
-        <w:spacing w:line="240" w:lineRule="auto"/>
-        <w:jc w:val="both"/>
-        <w:rPr>
-          <w:rFonts w:ascii="Times New Roman" w:cs="Times New Roman" w:eastAsia="Times New Roman" w:hAnsi="Times New Roman"/>
-          <w:sz w:val="28"/>
-          <w:szCs w:val="28"/>
-        </w:rPr>
-      </w:pPr>
-      <w:r>
-        <w:rPr>
-          <w:rFonts w:ascii="Times New Roman" w:cs="Times New Roman" w:eastAsia="Times New Roman" w:hAnsi="Times New Roman"/>
-          <w:sz w:val="28"/>
-          <w:szCs w:val="28"/>
-          <w:rtl w:val="0"/>
-        </w:rPr>
-        <w:t xml:space="preserve">su (substitute user) дозволяє змінити поточного користувача, найчастіше на root. Використовуючи su, користувач повністю переключається на інший обліковий запис, що дає йому доступ до всіх привілеїв того облікового запису. sudo дозволяє виконувати окремі команди з правами іншого користувача, зазвичай root, без необхідності повного перемикання на цього користувача. sudo також реєструє використання команд для забезпечення аудиту, чого не робить su. </w:t>
+        <w:ind w:left="1004" w:hanging="360"/>
+        <w:jc w:val="both"/>
+        <w:rPr>
+          <w:rFonts w:ascii="Times New Roman" w:cs="Times New Roman" w:eastAsia="Times New Roman" w:hAnsi="Times New Roman"/>
+          <w:sz w:val="28"/>
+          <w:szCs w:val="28"/>
+        </w:rPr>
+      </w:pPr>
+      <w:r>
+        <w:rPr>
+          <w:rFonts w:ascii="Times New Roman" w:cs="Times New Roman" w:eastAsia="Times New Roman" w:hAnsi="Times New Roman"/>
+          <w:sz w:val="28"/>
+          <w:szCs w:val="28"/>
+          <w:rtl w:val="0"/>
+        </w:rPr>
+        <w:t xml:space="preserve">*для кожного члену Вашої команди за допомогою терміналу створіть нового користувача (якщо працюєте самі, то просто трьох довільних користувачів), не забудьте після створення нового користувача одразу задати йому пароль;</w:t>
+      </w:r>
+    </w:p>
+    <w:p>
+      <w:pPr>
+        <w:spacing w:line="240" w:lineRule="auto"/>
+        <w:ind w:left="1004" w:firstLine="0"/>
+        <w:jc w:val="both"/>
+        <w:rPr>
+          <w:rFonts w:ascii="Times New Roman" w:cs="Times New Roman" w:eastAsia="Times New Roman" w:hAnsi="Times New Roman"/>
+          <w:sz w:val="28"/>
+          <w:szCs w:val="28"/>
+        </w:rPr>
+      </w:pPr>
+      <w:r>
+        <w:rPr>
+          <w:rtl w:val="0"/>
+        </w:rPr>
+      </w:r>
+    </w:p>
+    <w:p>
+      <w:pPr>
+        <w:spacing w:line="240" w:lineRule="auto"/>
+        <w:jc w:val="both"/>
+        <w:rPr>
+          <w:rFonts w:ascii="Times New Roman" w:cs="Times New Roman" w:eastAsia="Times New Roman" w:hAnsi="Times New Roman"/>
+          <w:sz w:val="28"/>
+          <w:szCs w:val="28"/>
+        </w:rPr>
+      </w:pPr>
+      <w:r>
+        <w:rPr>
+          <w:rFonts w:ascii="Times New Roman" w:cs="Times New Roman" w:eastAsia="Times New Roman" w:hAnsi="Times New Roman"/>
+          <w:sz w:val="28"/>
+          <w:szCs w:val="28"/>
+        </w:rPr>
+        <w:drawing>
+          <wp:inline distB="114300" distT="114300" distL="114300" distR="114300">
+            <wp:extent cx="5731200" cy="266700"/>
+            <wp:effectExtent b="0" l="0" r="0" t="0"/>
+            <wp:docPr id="17" name="image17.png"/>
+            <a:graphic>
+              <a:graphicData uri="http://schemas.openxmlformats.org/drawingml/2006/picture">
+                <pic:pic>
+                  <pic:nvPicPr>
+                    <pic:cNvPr id="0" name="image17.png"/>
+                    <pic:cNvPicPr preferRelativeResize="0"/>
+                  </pic:nvPicPr>
+                  <pic:blipFill>
+                    <a:blip r:embed="rId13"/>
+                    <a:srcRect b="0" l="0" r="0" t="0"/>
+                    <a:stretch>
+                      <a:fillRect/>
+                    </a:stretch>
+                  </pic:blipFill>
+                  <pic:spPr>
+                    <a:xfrm>
+                      <a:off x="0" y="0"/>
+                      <a:ext cx="5731200" cy="266700"/>
+                    </a:xfrm>
+                    <a:prstGeom prst="rect"/>
+                    <a:ln/>
+                  </pic:spPr>
+                </pic:pic>
+              </a:graphicData>
+            </a:graphic>
+          </wp:inline>
+        </w:drawing>
+      </w:r>
+      <w:r>
+        <w:rPr>
+          <w:rtl w:val="0"/>
+        </w:rPr>
+      </w:r>
+    </w:p>
+    <w:p>
+      <w:pPr>
+        <w:spacing w:line="240" w:lineRule="auto"/>
+        <w:jc w:val="both"/>
+        <w:rPr>
+          <w:rFonts w:ascii="Times New Roman" w:cs="Times New Roman" w:eastAsia="Times New Roman" w:hAnsi="Times New Roman"/>
+          <w:sz w:val="28"/>
+          <w:szCs w:val="28"/>
+        </w:rPr>
+      </w:pPr>
+      <w:r>
+        <w:rPr>
+          <w:rFonts w:ascii="Times New Roman" w:cs="Times New Roman" w:eastAsia="Times New Roman" w:hAnsi="Times New Roman"/>
+          <w:sz w:val="28"/>
+          <w:szCs w:val="28"/>
+        </w:rPr>
+        <w:drawing>
+          <wp:inline distB="114300" distT="114300" distL="114300" distR="114300">
+            <wp:extent cx="5191125" cy="695325"/>
+            <wp:effectExtent b="0" l="0" r="0" t="0"/>
+            <wp:docPr id="20" name="image8.png"/>
+            <a:graphic>
+              <a:graphicData uri="http://schemas.openxmlformats.org/drawingml/2006/picture">
+                <pic:pic>
+                  <pic:nvPicPr>
+                    <pic:cNvPr id="0" name="image8.png"/>
+                    <pic:cNvPicPr preferRelativeResize="0"/>
+                  </pic:nvPicPr>
+                  <pic:blipFill>
+                    <a:blip r:embed="rId14"/>
+                    <a:srcRect b="0" l="0" r="0" t="0"/>
+                    <a:stretch>
+                      <a:fillRect/>
+                    </a:stretch>
+                  </pic:blipFill>
+                  <pic:spPr>
+                    <a:xfrm>
+                      <a:off x="0" y="0"/>
+                      <a:ext cx="5191125" cy="695325"/>
+                    </a:xfrm>
+                    <a:prstGeom prst="rect"/>
+                    <a:ln/>
+                  </pic:spPr>
+                </pic:pic>
+              </a:graphicData>
+            </a:graphic>
+          </wp:inline>
+        </w:drawing>
+      </w:r>
+      <w:r>
+        <w:rPr>
+          <w:rtl w:val="0"/>
+        </w:rPr>
+      </w:r>
+    </w:p>
+    <w:p>
+      <w:pPr>
+        <w:spacing w:line="240" w:lineRule="auto"/>
+        <w:jc w:val="both"/>
+        <w:rPr>
+          <w:rFonts w:ascii="Times New Roman" w:cs="Times New Roman" w:eastAsia="Times New Roman" w:hAnsi="Times New Roman"/>
+          <w:sz w:val="28"/>
+          <w:szCs w:val="28"/>
+        </w:rPr>
+      </w:pPr>
+      <w:r>
+        <w:rPr>
+          <w:rFonts w:ascii="Times New Roman" w:cs="Times New Roman" w:eastAsia="Times New Roman" w:hAnsi="Times New Roman"/>
+          <w:sz w:val="28"/>
+          <w:szCs w:val="28"/>
+        </w:rPr>
+        <w:drawing>
+          <wp:inline distB="114300" distT="114300" distL="114300" distR="114300">
+            <wp:extent cx="5191125" cy="847725"/>
+            <wp:effectExtent b="0" l="0" r="0" t="0"/>
+            <wp:docPr id="8" name="image19.png"/>
+            <a:graphic>
+              <a:graphicData uri="http://schemas.openxmlformats.org/drawingml/2006/picture">
+                <pic:pic>
+                  <pic:nvPicPr>
+                    <pic:cNvPr id="0" name="image19.png"/>
+                    <pic:cNvPicPr preferRelativeResize="0"/>
+                  </pic:nvPicPr>
+                  <pic:blipFill>
+                    <a:blip r:embed="rId15"/>
+                    <a:srcRect b="0" l="0" r="0" t="0"/>
+                    <a:stretch>
+                      <a:fillRect/>
+                    </a:stretch>
+                  </pic:blipFill>
+                  <pic:spPr>
+                    <a:xfrm>
+                      <a:off x="0" y="0"/>
+                      <a:ext cx="5191125" cy="847725"/>
+                    </a:xfrm>
+                    <a:prstGeom prst="rect"/>
+                    <a:ln/>
+                  </pic:spPr>
+                </pic:pic>
+              </a:graphicData>
+            </a:graphic>
+          </wp:inline>
+        </w:drawing>
+      </w:r>
+      <w:r>
+        <w:rPr>
+          <w:rtl w:val="0"/>
+        </w:rPr>
       </w:r>
     </w:p>
     <w:p>
@@ -2641,70 +2637,91 @@
           <w:numId w:val="1"/>
         </w:numPr>
         <w:spacing w:line="240" w:lineRule="auto"/>
-        <w:ind w:left="709" w:hanging="349"/>
-        <w:jc w:val="both"/>
-        <w:rPr>
-          <w:rFonts w:ascii="Times New Roman" w:cs="Times New Roman" w:eastAsia="Times New Roman" w:hAnsi="Times New Roman"/>
-          <w:sz w:val="28"/>
-          <w:szCs w:val="28"/>
-        </w:rPr>
-      </w:pPr>
-      <w:r>
-        <w:rPr>
-          <w:rFonts w:ascii="Times New Roman" w:cs="Times New Roman" w:eastAsia="Times New Roman" w:hAnsi="Times New Roman"/>
-          <w:sz w:val="28"/>
-          <w:szCs w:val="28"/>
-          <w:rtl w:val="0"/>
-        </w:rPr>
-        <w:t xml:space="preserve">*Чому домашній каталог користувача root не розміщено в каталозі /home?</w:t>
-      </w:r>
-    </w:p>
-    <w:p>
-      <w:pPr>
-        <w:spacing w:line="240" w:lineRule="auto"/>
-        <w:jc w:val="both"/>
-        <w:rPr>
-          <w:rFonts w:ascii="Times New Roman" w:cs="Times New Roman" w:eastAsia="Times New Roman" w:hAnsi="Times New Roman"/>
-          <w:sz w:val="28"/>
-          <w:szCs w:val="28"/>
-        </w:rPr>
-      </w:pPr>
-      <w:r>
-        <w:rPr>
-          <w:rtl w:val="0"/>
-        </w:rPr>
-      </w:r>
-    </w:p>
-    <w:p>
-      <w:pPr>
-        <w:spacing w:line="240" w:lineRule="auto"/>
-        <w:jc w:val="both"/>
-        <w:rPr>
-          <w:rFonts w:ascii="Times New Roman" w:cs="Times New Roman" w:eastAsia="Times New Roman" w:hAnsi="Times New Roman"/>
-          <w:sz w:val="28"/>
-          <w:szCs w:val="28"/>
-        </w:rPr>
-      </w:pPr>
-      <w:r>
-        <w:rPr>
-          <w:rFonts w:ascii="Times New Roman" w:cs="Times New Roman" w:eastAsia="Times New Roman" w:hAnsi="Times New Roman"/>
-          <w:sz w:val="28"/>
-          <w:szCs w:val="28"/>
-          <w:rtl w:val="0"/>
-        </w:rPr>
-        <w:t xml:space="preserve">Домашній каталог root зазвичай знаходиться в /root, а не в /home, оскільки користувач root є спеціальним користувачем, який має права на всю систему і не потребує окремого робочого простору в загальному каталозі користувачів. Це також допомагає виділити root від звичайних користувачів, забезпечуючи більшу організацію та безпеку. </w:t>
-      </w:r>
-    </w:p>
-    <w:p>
-      <w:pPr>
-        <w:spacing w:line="240" w:lineRule="auto"/>
-        <w:jc w:val="both"/>
-        <w:rPr>
-          <w:rFonts w:ascii="Times New Roman" w:cs="Times New Roman" w:eastAsia="Times New Roman" w:hAnsi="Times New Roman"/>
-          <w:sz w:val="28"/>
-          <w:szCs w:val="28"/>
-        </w:rPr>
-      </w:pPr>
+        <w:ind w:left="1004" w:hanging="360"/>
+        <w:jc w:val="both"/>
+        <w:rPr>
+          <w:rFonts w:ascii="Times New Roman" w:cs="Times New Roman" w:eastAsia="Times New Roman" w:hAnsi="Times New Roman"/>
+          <w:color w:val="ff0000"/>
+          <w:sz w:val="28"/>
+          <w:szCs w:val="28"/>
+        </w:rPr>
+      </w:pPr>
+      <w:r>
+        <w:rPr>
+          <w:rFonts w:ascii="Times New Roman" w:cs="Times New Roman" w:eastAsia="Times New Roman" w:hAnsi="Times New Roman"/>
+          <w:sz w:val="28"/>
+          <w:szCs w:val="28"/>
+          <w:rtl w:val="0"/>
+        </w:rPr>
+        <w:t xml:space="preserve">**додайте нових користувачів у створені Вами нові групи таким чином, щоб у групах super_admins та noob_users було по 2 користувачі, один з яких є в обох групах, у групу good_students додайте всіх трьох користувачів;</w:t>
+      </w:r>
+    </w:p>
+    <w:p>
+      <w:pPr>
+        <w:spacing w:line="240" w:lineRule="auto"/>
+        <w:ind w:left="1004" w:firstLine="0"/>
+        <w:jc w:val="both"/>
+        <w:rPr>
+          <w:rFonts w:ascii="Times New Roman" w:cs="Times New Roman" w:eastAsia="Times New Roman" w:hAnsi="Times New Roman"/>
+          <w:sz w:val="28"/>
+          <w:szCs w:val="28"/>
+        </w:rPr>
+      </w:pPr>
+      <w:r>
+        <w:rPr>
+          <w:rtl w:val="0"/>
+        </w:rPr>
+      </w:r>
+    </w:p>
+    <w:p>
+      <w:pPr>
+        <w:spacing w:line="240" w:lineRule="auto"/>
+        <w:jc w:val="both"/>
+        <w:rPr>
+          <w:rFonts w:ascii="Times New Roman" w:cs="Times New Roman" w:eastAsia="Times New Roman" w:hAnsi="Times New Roman"/>
+          <w:sz w:val="28"/>
+          <w:szCs w:val="28"/>
+        </w:rPr>
+      </w:pPr>
+      <w:r>
+        <w:rPr>
+          <w:rFonts w:ascii="Times New Roman" w:cs="Times New Roman" w:eastAsia="Times New Roman" w:hAnsi="Times New Roman"/>
+          <w:sz w:val="28"/>
+          <w:szCs w:val="28"/>
+        </w:rPr>
+        <w:drawing>
+          <wp:inline distB="114300" distT="114300" distL="114300" distR="114300">
+            <wp:extent cx="4257675" cy="952500"/>
+            <wp:effectExtent b="0" l="0" r="0" t="0"/>
+            <wp:docPr id="11" name="image15.png"/>
+            <a:graphic>
+              <a:graphicData uri="http://schemas.openxmlformats.org/drawingml/2006/picture">
+                <pic:pic>
+                  <pic:nvPicPr>
+                    <pic:cNvPr id="0" name="image15.png"/>
+                    <pic:cNvPicPr preferRelativeResize="0"/>
+                  </pic:nvPicPr>
+                  <pic:blipFill>
+                    <a:blip r:embed="rId16"/>
+                    <a:srcRect b="0" l="0" r="0" t="0"/>
+                    <a:stretch>
+                      <a:fillRect/>
+                    </a:stretch>
+                  </pic:blipFill>
+                  <pic:spPr>
+                    <a:xfrm>
+                      <a:off x="0" y="0"/>
+                      <a:ext cx="4257675" cy="952500"/>
+                    </a:xfrm>
+                    <a:prstGeom prst="rect"/>
+                    <a:ln/>
+                  </pic:spPr>
+                </pic:pic>
+              </a:graphicData>
+            </a:graphic>
+          </wp:inline>
+        </w:drawing>
+      </w:r>
       <w:r>
         <w:rPr>
           <w:rtl w:val="0"/>
@@ -2718,58 +2735,94 @@
           <w:numId w:val="1"/>
         </w:numPr>
         <w:spacing w:line="240" w:lineRule="auto"/>
-        <w:ind w:left="709" w:hanging="349"/>
-        <w:jc w:val="both"/>
-        <w:rPr>
-          <w:rFonts w:ascii="Times New Roman" w:cs="Times New Roman" w:eastAsia="Times New Roman" w:hAnsi="Times New Roman"/>
-          <w:sz w:val="28"/>
-          <w:szCs w:val="28"/>
-        </w:rPr>
-      </w:pPr>
-      <w:r>
-        <w:rPr>
-          <w:rFonts w:ascii="Times New Roman" w:cs="Times New Roman" w:eastAsia="Times New Roman" w:hAnsi="Times New Roman"/>
-          <w:sz w:val="28"/>
-          <w:szCs w:val="28"/>
-          <w:rtl w:val="0"/>
-        </w:rPr>
-        <w:t xml:space="preserve">*Для чого використовується команда getent?</w:t>
-      </w:r>
-    </w:p>
-    <w:p>
-      <w:pPr>
-        <w:spacing w:line="240" w:lineRule="auto"/>
-        <w:jc w:val="both"/>
-        <w:rPr>
-          <w:rFonts w:ascii="Times New Roman" w:cs="Times New Roman" w:eastAsia="Times New Roman" w:hAnsi="Times New Roman"/>
-          <w:sz w:val="28"/>
-          <w:szCs w:val="28"/>
-        </w:rPr>
-      </w:pPr>
-      <w:r>
-        <w:rPr>
-          <w:rtl w:val="0"/>
-        </w:rPr>
-      </w:r>
-    </w:p>
-    <w:p>
-      <w:pPr>
-        <w:spacing w:line="240" w:lineRule="auto"/>
-        <w:jc w:val="both"/>
-        <w:rPr>
-          <w:rFonts w:ascii="Times New Roman" w:cs="Times New Roman" w:eastAsia="Times New Roman" w:hAnsi="Times New Roman"/>
-          <w:sz w:val="28"/>
-          <w:szCs w:val="28"/>
-        </w:rPr>
-      </w:pPr>
-      <w:r>
-        <w:rPr>
-          <w:rFonts w:ascii="Times New Roman" w:cs="Times New Roman" w:eastAsia="Times New Roman" w:hAnsi="Times New Roman"/>
-          <w:sz w:val="28"/>
-          <w:szCs w:val="28"/>
-          <w:rtl w:val="0"/>
-        </w:rPr>
-        <w:t xml:space="preserve">Команда getent використовується для отримання інформації з різних баз даних системи, таких як інформація про користувачів, групи, хости, сервіси тощо. Наприклад, її можна використати для перевірки записів з /etc/passwd, /etc/group або для отримання даних з мережевих баз даних. </w:t>
+        <w:ind w:left="1004" w:hanging="360"/>
+        <w:jc w:val="both"/>
+        <w:rPr>
+          <w:rFonts w:ascii="Times New Roman" w:cs="Times New Roman" w:eastAsia="Times New Roman" w:hAnsi="Times New Roman"/>
+          <w:sz w:val="28"/>
+          <w:szCs w:val="28"/>
+        </w:rPr>
+      </w:pPr>
+      <w:r>
+        <w:rPr>
+          <w:rFonts w:ascii="Times New Roman" w:cs="Times New Roman" w:eastAsia="Times New Roman" w:hAnsi="Times New Roman"/>
+          <w:sz w:val="28"/>
+          <w:szCs w:val="28"/>
+          <w:rtl w:val="0"/>
+        </w:rPr>
+        <w:t xml:space="preserve">**перегляньте інформацію про групи, та які користувачі до них входять, поясніть що ви бачите;</w:t>
+      </w:r>
+    </w:p>
+    <w:p>
+      <w:pPr>
+        <w:spacing w:line="240" w:lineRule="auto"/>
+        <w:ind w:left="1004" w:firstLine="0"/>
+        <w:jc w:val="both"/>
+        <w:rPr>
+          <w:rFonts w:ascii="Times New Roman" w:cs="Times New Roman" w:eastAsia="Times New Roman" w:hAnsi="Times New Roman"/>
+          <w:sz w:val="28"/>
+          <w:szCs w:val="28"/>
+        </w:rPr>
+      </w:pPr>
+      <w:r>
+        <w:rPr>
+          <w:rtl w:val="0"/>
+        </w:rPr>
+      </w:r>
+    </w:p>
+    <w:p>
+      <w:pPr>
+        <w:spacing w:line="240" w:lineRule="auto"/>
+        <w:jc w:val="both"/>
+        <w:rPr>
+          <w:rFonts w:ascii="Times New Roman" w:cs="Times New Roman" w:eastAsia="Times New Roman" w:hAnsi="Times New Roman"/>
+          <w:sz w:val="28"/>
+          <w:szCs w:val="28"/>
+        </w:rPr>
+      </w:pPr>
+      <w:r>
+        <w:rPr>
+          <w:rFonts w:ascii="Times New Roman" w:cs="Times New Roman" w:eastAsia="Times New Roman" w:hAnsi="Times New Roman"/>
+          <w:sz w:val="28"/>
+          <w:szCs w:val="28"/>
+        </w:rPr>
+        <w:drawing>
+          <wp:inline distB="114300" distT="114300" distL="114300" distR="114300">
+            <wp:extent cx="3914775" cy="895350"/>
+            <wp:effectExtent b="0" l="0" r="0" t="0"/>
+            <wp:docPr id="16" name="image3.png"/>
+            <a:graphic>
+              <a:graphicData uri="http://schemas.openxmlformats.org/drawingml/2006/picture">
+                <pic:pic>
+                  <pic:nvPicPr>
+                    <pic:cNvPr id="0" name="image3.png"/>
+                    <pic:cNvPicPr preferRelativeResize="0"/>
+                  </pic:nvPicPr>
+                  <pic:blipFill>
+                    <a:blip r:embed="rId17"/>
+                    <a:srcRect b="0" l="0" r="0" t="0"/>
+                    <a:stretch>
+                      <a:fillRect/>
+                    </a:stretch>
+                  </pic:blipFill>
+                  <pic:spPr>
+                    <a:xfrm>
+                      <a:off x="0" y="0"/>
+                      <a:ext cx="3914775" cy="895350"/>
+                    </a:xfrm>
+                    <a:prstGeom prst="rect"/>
+                    <a:ln/>
+                  </pic:spPr>
+                </pic:pic>
+              </a:graphicData>
+            </a:graphic>
+          </wp:inline>
+        </w:drawing>
+      </w:r>
+      <w:r>
+        <w:rPr>
+          <w:rtl w:val="0"/>
+        </w:rPr>
       </w:r>
     </w:p>
     <w:p>
@@ -2795,58 +2848,77 @@
           <w:numId w:val="1"/>
         </w:numPr>
         <w:spacing w:line="240" w:lineRule="auto"/>
-        <w:ind w:left="709" w:hanging="349"/>
-        <w:jc w:val="both"/>
-        <w:rPr>
-          <w:rFonts w:ascii="Times New Roman" w:cs="Times New Roman" w:eastAsia="Times New Roman" w:hAnsi="Times New Roman"/>
-          <w:sz w:val="28"/>
-          <w:szCs w:val="28"/>
-        </w:rPr>
-      </w:pPr>
-      <w:r>
-        <w:rPr>
-          <w:rFonts w:ascii="Times New Roman" w:cs="Times New Roman" w:eastAsia="Times New Roman" w:hAnsi="Times New Roman"/>
-          <w:sz w:val="28"/>
-          <w:szCs w:val="28"/>
-          <w:rtl w:val="0"/>
-        </w:rPr>
-        <w:t xml:space="preserve">*Як можна змінити пароль користувача?</w:t>
-      </w:r>
-    </w:p>
-    <w:p>
-      <w:pPr>
-        <w:spacing w:line="240" w:lineRule="auto"/>
-        <w:jc w:val="both"/>
-        <w:rPr>
-          <w:rFonts w:ascii="Times New Roman" w:cs="Times New Roman" w:eastAsia="Times New Roman" w:hAnsi="Times New Roman"/>
-          <w:sz w:val="28"/>
-          <w:szCs w:val="28"/>
-        </w:rPr>
-      </w:pPr>
-      <w:r>
-        <w:rPr>
-          <w:rtl w:val="0"/>
-        </w:rPr>
-      </w:r>
-    </w:p>
-    <w:p>
-      <w:pPr>
-        <w:spacing w:line="240" w:lineRule="auto"/>
-        <w:jc w:val="both"/>
-        <w:rPr>
-          <w:rFonts w:ascii="Times New Roman" w:cs="Times New Roman" w:eastAsia="Times New Roman" w:hAnsi="Times New Roman"/>
-          <w:sz w:val="28"/>
-          <w:szCs w:val="28"/>
-        </w:rPr>
-      </w:pPr>
-      <w:r>
-        <w:rPr>
-          <w:rFonts w:ascii="Times New Roman" w:cs="Times New Roman" w:eastAsia="Times New Roman" w:hAnsi="Times New Roman"/>
-          <w:sz w:val="28"/>
-          <w:szCs w:val="28"/>
-          <w:rtl w:val="0"/>
-        </w:rPr>
-        <w:t xml:space="preserve">Для зміни пароля користувача використовується команда passwd. Адміністратор може змінити пароль для будь-якого користувача, вказавши ім’я користувача після команди, наприклад: passwd user1. Користувач може змінити свій пароль за допомогою цієї ж команди без вказування імені користувача.</w:t>
+        <w:ind w:left="1004" w:hanging="360"/>
+        <w:jc w:val="both"/>
+        <w:rPr>
+          <w:rFonts w:ascii="Times New Roman" w:cs="Times New Roman" w:eastAsia="Times New Roman" w:hAnsi="Times New Roman"/>
+          <w:sz w:val="28"/>
+          <w:szCs w:val="28"/>
+        </w:rPr>
+      </w:pPr>
+      <w:r>
+        <w:rPr>
+          <w:rFonts w:ascii="Times New Roman" w:cs="Times New Roman" w:eastAsia="Times New Roman" w:hAnsi="Times New Roman"/>
+          <w:sz w:val="28"/>
+          <w:szCs w:val="28"/>
+          <w:rtl w:val="0"/>
+        </w:rPr>
+        <w:t xml:space="preserve">**видаліть першого створеного вами користувача, перегляньте чи залишиться інформація про нього в групах, де він перебував;</w:t>
+      </w:r>
+    </w:p>
+    <w:p>
+      <w:pPr>
+        <w:spacing w:line="240" w:lineRule="auto"/>
+        <w:jc w:val="both"/>
+        <w:rPr>
+          <w:rFonts w:ascii="Times New Roman" w:cs="Times New Roman" w:eastAsia="Times New Roman" w:hAnsi="Times New Roman"/>
+          <w:sz w:val="28"/>
+          <w:szCs w:val="28"/>
+        </w:rPr>
+      </w:pPr>
+      <w:r>
+        <w:rPr>
+          <w:rFonts w:ascii="Times New Roman" w:cs="Times New Roman" w:eastAsia="Times New Roman" w:hAnsi="Times New Roman"/>
+          <w:sz w:val="28"/>
+          <w:szCs w:val="28"/>
+        </w:rPr>
+        <w:drawing>
+          <wp:inline distB="114300" distT="114300" distL="114300" distR="114300">
+            <wp:extent cx="4029075" cy="762000"/>
+            <wp:effectExtent b="0" l="0" r="0" t="0"/>
+            <wp:docPr id="13" name="image1.png"/>
+            <a:graphic>
+              <a:graphicData uri="http://schemas.openxmlformats.org/drawingml/2006/picture">
+                <pic:pic>
+                  <pic:nvPicPr>
+                    <pic:cNvPr id="0" name="image1.png"/>
+                    <pic:cNvPicPr preferRelativeResize="0"/>
+                  </pic:nvPicPr>
+                  <pic:blipFill>
+                    <a:blip r:embed="rId18"/>
+                    <a:srcRect b="0" l="0" r="0" t="0"/>
+                    <a:stretch>
+                      <a:fillRect/>
+                    </a:stretch>
+                  </pic:blipFill>
+                  <pic:spPr>
+                    <a:xfrm>
+                      <a:off x="0" y="0"/>
+                      <a:ext cx="4029075" cy="762000"/>
+                    </a:xfrm>
+                    <a:prstGeom prst="rect"/>
+                    <a:ln/>
+                  </pic:spPr>
+                </pic:pic>
+              </a:graphicData>
+            </a:graphic>
+          </wp:inline>
+        </w:drawing>
+      </w:r>
+      <w:r>
+        <w:rPr>
+          <w:rtl w:val="0"/>
+        </w:rPr>
       </w:r>
     </w:p>
     <w:p>
@@ -2872,58 +2944,94 @@
           <w:numId w:val="1"/>
         </w:numPr>
         <w:spacing w:line="240" w:lineRule="auto"/>
-        <w:ind w:left="709" w:hanging="349"/>
-        <w:jc w:val="both"/>
-        <w:rPr>
-          <w:rFonts w:ascii="Times New Roman" w:cs="Times New Roman" w:eastAsia="Times New Roman" w:hAnsi="Times New Roman"/>
-          <w:sz w:val="28"/>
-          <w:szCs w:val="28"/>
-        </w:rPr>
-      </w:pPr>
-      <w:r>
-        <w:rPr>
-          <w:rFonts w:ascii="Times New Roman" w:cs="Times New Roman" w:eastAsia="Times New Roman" w:hAnsi="Times New Roman"/>
-          <w:sz w:val="28"/>
-          <w:szCs w:val="28"/>
-          <w:rtl w:val="0"/>
-        </w:rPr>
-        <w:t xml:space="preserve">**Яким чином можна видалити існуючі групи користувачів? Чи залишиться інформація про них десь у системі?</w:t>
-      </w:r>
-    </w:p>
-    <w:p>
-      <w:pPr>
-        <w:spacing w:line="240" w:lineRule="auto"/>
-        <w:jc w:val="both"/>
-        <w:rPr>
-          <w:rFonts w:ascii="Times New Roman" w:cs="Times New Roman" w:eastAsia="Times New Roman" w:hAnsi="Times New Roman"/>
-          <w:sz w:val="28"/>
-          <w:szCs w:val="28"/>
-        </w:rPr>
-      </w:pPr>
-      <w:r>
-        <w:rPr>
-          <w:rtl w:val="0"/>
-        </w:rPr>
-      </w:r>
-    </w:p>
-    <w:p>
-      <w:pPr>
-        <w:spacing w:line="240" w:lineRule="auto"/>
-        <w:jc w:val="both"/>
-        <w:rPr>
-          <w:rFonts w:ascii="Times New Roman" w:cs="Times New Roman" w:eastAsia="Times New Roman" w:hAnsi="Times New Roman"/>
-          <w:sz w:val="28"/>
-          <w:szCs w:val="28"/>
-        </w:rPr>
-      </w:pPr>
-      <w:r>
-        <w:rPr>
-          <w:rFonts w:ascii="Times New Roman" w:cs="Times New Roman" w:eastAsia="Times New Roman" w:hAnsi="Times New Roman"/>
-          <w:sz w:val="28"/>
-          <w:szCs w:val="28"/>
-          <w:rtl w:val="0"/>
-        </w:rPr>
-        <w:t xml:space="preserve">Для видалення групи користувачів використовується команда groupdel. Вона видаляє групу, але інформація про неї в системі може залишитись у журналах чи конфігураційних файлах, таких як /etc/group, де відображаються всі наявні групи. Тому хоча група і буде видалена з цієї бази, може залишитись інформація про неї в системних записах чи в історії команд. </w:t>
+        <w:ind w:left="1004" w:hanging="360"/>
+        <w:jc w:val="both"/>
+        <w:rPr>
+          <w:rFonts w:ascii="Times New Roman" w:cs="Times New Roman" w:eastAsia="Times New Roman" w:hAnsi="Times New Roman"/>
+          <w:sz w:val="28"/>
+          <w:szCs w:val="28"/>
+        </w:rPr>
+      </w:pPr>
+      <w:r>
+        <w:rPr>
+          <w:rFonts w:ascii="Times New Roman" w:cs="Times New Roman" w:eastAsia="Times New Roman" w:hAnsi="Times New Roman"/>
+          <w:sz w:val="28"/>
+          <w:szCs w:val="28"/>
+          <w:rtl w:val="0"/>
+        </w:rPr>
+        <w:t xml:space="preserve">**видаліть другого користувача, перегляньте чи залишиться інформація про нього в групах, де він перебував; </w:t>
+      </w:r>
+    </w:p>
+    <w:p>
+      <w:pPr>
+        <w:spacing w:line="240" w:lineRule="auto"/>
+        <w:ind w:left="1004" w:firstLine="0"/>
+        <w:jc w:val="both"/>
+        <w:rPr>
+          <w:rFonts w:ascii="Times New Roman" w:cs="Times New Roman" w:eastAsia="Times New Roman" w:hAnsi="Times New Roman"/>
+          <w:sz w:val="28"/>
+          <w:szCs w:val="28"/>
+        </w:rPr>
+      </w:pPr>
+      <w:r>
+        <w:rPr>
+          <w:rtl w:val="0"/>
+        </w:rPr>
+      </w:r>
+    </w:p>
+    <w:p>
+      <w:pPr>
+        <w:spacing w:line="240" w:lineRule="auto"/>
+        <w:jc w:val="both"/>
+        <w:rPr>
+          <w:rFonts w:ascii="Times New Roman" w:cs="Times New Roman" w:eastAsia="Times New Roman" w:hAnsi="Times New Roman"/>
+          <w:sz w:val="28"/>
+          <w:szCs w:val="28"/>
+        </w:rPr>
+      </w:pPr>
+      <w:r>
+        <w:rPr>
+          <w:rFonts w:ascii="Times New Roman" w:cs="Times New Roman" w:eastAsia="Times New Roman" w:hAnsi="Times New Roman"/>
+          <w:sz w:val="28"/>
+          <w:szCs w:val="28"/>
+        </w:rPr>
+        <w:drawing>
+          <wp:inline distB="114300" distT="114300" distL="114300" distR="114300">
+            <wp:extent cx="3876675" cy="1123950"/>
+            <wp:effectExtent b="0" l="0" r="0" t="0"/>
+            <wp:docPr id="1" name="image7.png"/>
+            <a:graphic>
+              <a:graphicData uri="http://schemas.openxmlformats.org/drawingml/2006/picture">
+                <pic:pic>
+                  <pic:nvPicPr>
+                    <pic:cNvPr id="0" name="image7.png"/>
+                    <pic:cNvPicPr preferRelativeResize="0"/>
+                  </pic:nvPicPr>
+                  <pic:blipFill>
+                    <a:blip r:embed="rId19"/>
+                    <a:srcRect b="0" l="0" r="0" t="0"/>
+                    <a:stretch>
+                      <a:fillRect/>
+                    </a:stretch>
+                  </pic:blipFill>
+                  <pic:spPr>
+                    <a:xfrm>
+                      <a:off x="0" y="0"/>
+                      <a:ext cx="3876675" cy="1123950"/>
+                    </a:xfrm>
+                    <a:prstGeom prst="rect"/>
+                    <a:ln/>
+                  </pic:spPr>
+                </pic:pic>
+              </a:graphicData>
+            </a:graphic>
+          </wp:inline>
+        </w:drawing>
+      </w:r>
+      <w:r>
+        <w:rPr>
+          <w:rtl w:val="0"/>
+        </w:rPr>
       </w:r>
     </w:p>
     <w:p>
@@ -2949,70 +3057,91 @@
           <w:numId w:val="1"/>
         </w:numPr>
         <w:spacing w:line="240" w:lineRule="auto"/>
-        <w:ind w:left="709" w:hanging="349"/>
-        <w:jc w:val="both"/>
-        <w:rPr>
-          <w:rFonts w:ascii="Times New Roman" w:cs="Times New Roman" w:eastAsia="Times New Roman" w:hAnsi="Times New Roman"/>
-          <w:sz w:val="28"/>
-          <w:szCs w:val="28"/>
-        </w:rPr>
-      </w:pPr>
-      <w:r>
-        <w:rPr>
-          <w:rFonts w:ascii="Times New Roman" w:cs="Times New Roman" w:eastAsia="Times New Roman" w:hAnsi="Times New Roman"/>
-          <w:sz w:val="28"/>
-          <w:szCs w:val="28"/>
-          <w:rtl w:val="0"/>
-        </w:rPr>
-        <w:t xml:space="preserve">**Яке призначення команди chage?</w:t>
-      </w:r>
-    </w:p>
-    <w:p>
-      <w:pPr>
-        <w:spacing w:line="240" w:lineRule="auto"/>
-        <w:jc w:val="both"/>
-        <w:rPr>
-          <w:rFonts w:ascii="Times New Roman" w:cs="Times New Roman" w:eastAsia="Times New Roman" w:hAnsi="Times New Roman"/>
-          <w:sz w:val="28"/>
-          <w:szCs w:val="28"/>
-        </w:rPr>
-      </w:pPr>
-      <w:r>
-        <w:rPr>
-          <w:rtl w:val="0"/>
-        </w:rPr>
-      </w:r>
-    </w:p>
-    <w:p>
-      <w:pPr>
-        <w:spacing w:line="240" w:lineRule="auto"/>
-        <w:jc w:val="both"/>
-        <w:rPr>
-          <w:rFonts w:ascii="Times New Roman" w:cs="Times New Roman" w:eastAsia="Times New Roman" w:hAnsi="Times New Roman"/>
-          <w:sz w:val="28"/>
-          <w:szCs w:val="28"/>
-        </w:rPr>
-      </w:pPr>
-      <w:r>
-        <w:rPr>
-          <w:rFonts w:ascii="Times New Roman" w:cs="Times New Roman" w:eastAsia="Times New Roman" w:hAnsi="Times New Roman"/>
-          <w:sz w:val="28"/>
-          <w:szCs w:val="28"/>
-          <w:rtl w:val="0"/>
-        </w:rPr>
-        <w:t xml:space="preserve">Команда chage використовується для зміни параметрів терміну дії пароля користувача, таких як максимальний та мінімальний терміни дії пароля, інтервал між змінами пароля, а також повідомлення про необхідність змінити пароль. </w:t>
-      </w:r>
-    </w:p>
-    <w:p>
-      <w:pPr>
-        <w:spacing w:line="240" w:lineRule="auto"/>
-        <w:jc w:val="both"/>
-        <w:rPr>
-          <w:rFonts w:ascii="Times New Roman" w:cs="Times New Roman" w:eastAsia="Times New Roman" w:hAnsi="Times New Roman"/>
-          <w:sz w:val="28"/>
-          <w:szCs w:val="28"/>
-        </w:rPr>
-      </w:pPr>
+        <w:ind w:left="1004" w:hanging="360"/>
+        <w:jc w:val="both"/>
+        <w:rPr>
+          <w:rFonts w:ascii="Times New Roman" w:cs="Times New Roman" w:eastAsia="Times New Roman" w:hAnsi="Times New Roman"/>
+          <w:color w:val="ff0000"/>
+          <w:sz w:val="28"/>
+          <w:szCs w:val="28"/>
+        </w:rPr>
+      </w:pPr>
+      <w:r>
+        <w:rPr>
+          <w:rFonts w:ascii="Times New Roman" w:cs="Times New Roman" w:eastAsia="Times New Roman" w:hAnsi="Times New Roman"/>
+          <w:sz w:val="28"/>
+          <w:szCs w:val="28"/>
+          <w:rtl w:val="0"/>
+        </w:rPr>
+        <w:t xml:space="preserve">**видаліть третього користувача, перегляньте чи залишиться інформація про нього в групах, де він перебував; </w:t>
+      </w:r>
+    </w:p>
+    <w:p>
+      <w:pPr>
+        <w:spacing w:line="240" w:lineRule="auto"/>
+        <w:ind w:left="1004" w:firstLine="0"/>
+        <w:jc w:val="both"/>
+        <w:rPr>
+          <w:rFonts w:ascii="Times New Roman" w:cs="Times New Roman" w:eastAsia="Times New Roman" w:hAnsi="Times New Roman"/>
+          <w:sz w:val="28"/>
+          <w:szCs w:val="28"/>
+        </w:rPr>
+      </w:pPr>
+      <w:r>
+        <w:rPr>
+          <w:rtl w:val="0"/>
+        </w:rPr>
+      </w:r>
+    </w:p>
+    <w:p>
+      <w:pPr>
+        <w:spacing w:line="240" w:lineRule="auto"/>
+        <w:jc w:val="both"/>
+        <w:rPr>
+          <w:rFonts w:ascii="Times New Roman" w:cs="Times New Roman" w:eastAsia="Times New Roman" w:hAnsi="Times New Roman"/>
+          <w:sz w:val="28"/>
+          <w:szCs w:val="28"/>
+        </w:rPr>
+      </w:pPr>
+      <w:r>
+        <w:rPr>
+          <w:rFonts w:ascii="Times New Roman" w:cs="Times New Roman" w:eastAsia="Times New Roman" w:hAnsi="Times New Roman"/>
+          <w:sz w:val="28"/>
+          <w:szCs w:val="28"/>
+        </w:rPr>
+        <w:drawing>
+          <wp:inline distB="114300" distT="114300" distL="114300" distR="114300">
+            <wp:extent cx="3800475" cy="695325"/>
+            <wp:effectExtent b="0" l="0" r="0" t="0"/>
+            <wp:docPr id="4" name="image11.png"/>
+            <a:graphic>
+              <a:graphicData uri="http://schemas.openxmlformats.org/drawingml/2006/picture">
+                <pic:pic>
+                  <pic:nvPicPr>
+                    <pic:cNvPr id="0" name="image11.png"/>
+                    <pic:cNvPicPr preferRelativeResize="0"/>
+                  </pic:nvPicPr>
+                  <pic:blipFill>
+                    <a:blip r:embed="rId20"/>
+                    <a:srcRect b="0" l="0" r="0" t="0"/>
+                    <a:stretch>
+                      <a:fillRect/>
+                    </a:stretch>
+                  </pic:blipFill>
+                  <pic:spPr>
+                    <a:xfrm>
+                      <a:off x="0" y="0"/>
+                      <a:ext cx="3800475" cy="695325"/>
+                    </a:xfrm>
+                    <a:prstGeom prst="rect"/>
+                    <a:ln/>
+                  </pic:spPr>
+                </pic:pic>
+              </a:graphicData>
+            </a:graphic>
+          </wp:inline>
+        </w:drawing>
+      </w:r>
       <w:r>
         <w:rPr>
           <w:rtl w:val="0"/>
@@ -3024,6 +3153,1169 @@
         <w:numPr>
           <w:ilvl w:val="0"/>
           <w:numId w:val="1"/>
+        </w:numPr>
+        <w:spacing w:line="240" w:lineRule="auto"/>
+        <w:ind w:left="1004" w:hanging="360"/>
+        <w:jc w:val="both"/>
+        <w:rPr>
+          <w:rFonts w:ascii="Times New Roman" w:cs="Times New Roman" w:eastAsia="Times New Roman" w:hAnsi="Times New Roman"/>
+          <w:sz w:val="28"/>
+          <w:szCs w:val="28"/>
+        </w:rPr>
+      </w:pPr>
+      <w:r>
+        <w:rPr>
+          <w:rFonts w:ascii="Times New Roman" w:cs="Times New Roman" w:eastAsia="Times New Roman" w:hAnsi="Times New Roman"/>
+          <w:sz w:val="28"/>
+          <w:szCs w:val="28"/>
+          <w:rtl w:val="0"/>
+        </w:rPr>
+        <w:t xml:space="preserve">**перегляньте інформацію про існуючі групи користувачів;</w:t>
+      </w:r>
+    </w:p>
+    <w:p>
+      <w:pPr>
+        <w:spacing w:line="240" w:lineRule="auto"/>
+        <w:ind w:left="1004" w:firstLine="0"/>
+        <w:jc w:val="both"/>
+        <w:rPr>
+          <w:rFonts w:ascii="Times New Roman" w:cs="Times New Roman" w:eastAsia="Times New Roman" w:hAnsi="Times New Roman"/>
+          <w:sz w:val="28"/>
+          <w:szCs w:val="28"/>
+        </w:rPr>
+      </w:pPr>
+      <w:r>
+        <w:rPr>
+          <w:rtl w:val="0"/>
+        </w:rPr>
+      </w:r>
+    </w:p>
+    <w:p>
+      <w:pPr>
+        <w:spacing w:line="240" w:lineRule="auto"/>
+        <w:jc w:val="both"/>
+        <w:rPr>
+          <w:rFonts w:ascii="Times New Roman" w:cs="Times New Roman" w:eastAsia="Times New Roman" w:hAnsi="Times New Roman"/>
+          <w:sz w:val="28"/>
+          <w:szCs w:val="28"/>
+        </w:rPr>
+      </w:pPr>
+      <w:r>
+        <w:rPr>
+          <w:rFonts w:ascii="Times New Roman" w:cs="Times New Roman" w:eastAsia="Times New Roman" w:hAnsi="Times New Roman"/>
+          <w:sz w:val="28"/>
+          <w:szCs w:val="28"/>
+        </w:rPr>
+        <w:drawing>
+          <wp:inline distB="114300" distT="114300" distL="114300" distR="114300">
+            <wp:extent cx="2738438" cy="3091115"/>
+            <wp:effectExtent b="0" l="0" r="0" t="0"/>
+            <wp:docPr id="5" name="image16.png"/>
+            <a:graphic>
+              <a:graphicData uri="http://schemas.openxmlformats.org/drawingml/2006/picture">
+                <pic:pic>
+                  <pic:nvPicPr>
+                    <pic:cNvPr id="0" name="image16.png"/>
+                    <pic:cNvPicPr preferRelativeResize="0"/>
+                  </pic:nvPicPr>
+                  <pic:blipFill>
+                    <a:blip r:embed="rId21"/>
+                    <a:srcRect b="0" l="0" r="0" t="0"/>
+                    <a:stretch>
+                      <a:fillRect/>
+                    </a:stretch>
+                  </pic:blipFill>
+                  <pic:spPr>
+                    <a:xfrm>
+                      <a:off x="0" y="0"/>
+                      <a:ext cx="2738438" cy="3091115"/>
+                    </a:xfrm>
+                    <a:prstGeom prst="rect"/>
+                    <a:ln/>
+                  </pic:spPr>
+                </pic:pic>
+              </a:graphicData>
+            </a:graphic>
+          </wp:inline>
+        </w:drawing>
+      </w:r>
+      <w:r>
+        <w:rPr>
+          <w:rFonts w:ascii="Times New Roman" w:cs="Times New Roman" w:eastAsia="Times New Roman" w:hAnsi="Times New Roman"/>
+          <w:sz w:val="28"/>
+          <w:szCs w:val="28"/>
+        </w:rPr>
+        <w:drawing>
+          <wp:inline distB="114300" distT="114300" distL="114300" distR="114300">
+            <wp:extent cx="2276475" cy="2457450"/>
+            <wp:effectExtent b="0" l="0" r="0" t="0"/>
+            <wp:docPr id="12" name="image6.png"/>
+            <a:graphic>
+              <a:graphicData uri="http://schemas.openxmlformats.org/drawingml/2006/picture">
+                <pic:pic>
+                  <pic:nvPicPr>
+                    <pic:cNvPr id="0" name="image6.png"/>
+                    <pic:cNvPicPr preferRelativeResize="0"/>
+                  </pic:nvPicPr>
+                  <pic:blipFill>
+                    <a:blip r:embed="rId22"/>
+                    <a:srcRect b="0" l="0" r="0" t="0"/>
+                    <a:stretch>
+                      <a:fillRect/>
+                    </a:stretch>
+                  </pic:blipFill>
+                  <pic:spPr>
+                    <a:xfrm>
+                      <a:off x="0" y="0"/>
+                      <a:ext cx="2276475" cy="2457450"/>
+                    </a:xfrm>
+                    <a:prstGeom prst="rect"/>
+                    <a:ln/>
+                  </pic:spPr>
+                </pic:pic>
+              </a:graphicData>
+            </a:graphic>
+          </wp:inline>
+        </w:drawing>
+      </w:r>
+      <w:r>
+        <w:rPr>
+          <w:rtl w:val="0"/>
+        </w:rPr>
+      </w:r>
+    </w:p>
+    <w:p>
+      <w:pPr>
+        <w:spacing w:line="240" w:lineRule="auto"/>
+        <w:jc w:val="both"/>
+        <w:rPr>
+          <w:rFonts w:ascii="Times New Roman" w:cs="Times New Roman" w:eastAsia="Times New Roman" w:hAnsi="Times New Roman"/>
+          <w:sz w:val="28"/>
+          <w:szCs w:val="28"/>
+        </w:rPr>
+      </w:pPr>
+      <w:r>
+        <w:rPr>
+          <w:rtl w:val="0"/>
+        </w:rPr>
+      </w:r>
+    </w:p>
+    <w:p>
+      <w:pPr>
+        <w:numPr>
+          <w:ilvl w:val="0"/>
+          <w:numId w:val="1"/>
+        </w:numPr>
+        <w:spacing w:line="240" w:lineRule="auto"/>
+        <w:ind w:left="1004" w:hanging="360"/>
+        <w:jc w:val="both"/>
+        <w:rPr>
+          <w:rFonts w:ascii="Times New Roman" w:cs="Times New Roman" w:eastAsia="Times New Roman" w:hAnsi="Times New Roman"/>
+          <w:sz w:val="28"/>
+          <w:szCs w:val="28"/>
+        </w:rPr>
+      </w:pPr>
+      <w:r>
+        <w:rPr>
+          <w:rFonts w:ascii="Times New Roman" w:cs="Times New Roman" w:eastAsia="Times New Roman" w:hAnsi="Times New Roman"/>
+          <w:sz w:val="28"/>
+          <w:szCs w:val="28"/>
+          <w:rtl w:val="0"/>
+        </w:rPr>
+        <w:t xml:space="preserve">**видаліть створені Вами групи користувачів;</w:t>
+      </w:r>
+    </w:p>
+    <w:p>
+      <w:pPr>
+        <w:spacing w:line="240" w:lineRule="auto"/>
+        <w:ind w:left="1004" w:firstLine="0"/>
+        <w:jc w:val="both"/>
+        <w:rPr>
+          <w:rFonts w:ascii="Times New Roman" w:cs="Times New Roman" w:eastAsia="Times New Roman" w:hAnsi="Times New Roman"/>
+          <w:sz w:val="28"/>
+          <w:szCs w:val="28"/>
+        </w:rPr>
+      </w:pPr>
+      <w:r>
+        <w:rPr>
+          <w:rtl w:val="0"/>
+        </w:rPr>
+      </w:r>
+    </w:p>
+    <w:p>
+      <w:pPr>
+        <w:spacing w:line="240" w:lineRule="auto"/>
+        <w:jc w:val="both"/>
+        <w:rPr>
+          <w:rFonts w:ascii="Times New Roman" w:cs="Times New Roman" w:eastAsia="Times New Roman" w:hAnsi="Times New Roman"/>
+          <w:sz w:val="28"/>
+          <w:szCs w:val="28"/>
+        </w:rPr>
+      </w:pPr>
+      <w:r>
+        <w:rPr>
+          <w:rFonts w:ascii="Times New Roman" w:cs="Times New Roman" w:eastAsia="Times New Roman" w:hAnsi="Times New Roman"/>
+          <w:sz w:val="28"/>
+          <w:szCs w:val="28"/>
+        </w:rPr>
+        <w:drawing>
+          <wp:inline distB="114300" distT="114300" distL="114300" distR="114300">
+            <wp:extent cx="3781425" cy="762000"/>
+            <wp:effectExtent b="0" l="0" r="0" t="0"/>
+            <wp:docPr id="2" name="image12.png"/>
+            <a:graphic>
+              <a:graphicData uri="http://schemas.openxmlformats.org/drawingml/2006/picture">
+                <pic:pic>
+                  <pic:nvPicPr>
+                    <pic:cNvPr id="0" name="image12.png"/>
+                    <pic:cNvPicPr preferRelativeResize="0"/>
+                  </pic:nvPicPr>
+                  <pic:blipFill>
+                    <a:blip r:embed="rId23"/>
+                    <a:srcRect b="0" l="0" r="0" t="0"/>
+                    <a:stretch>
+                      <a:fillRect/>
+                    </a:stretch>
+                  </pic:blipFill>
+                  <pic:spPr>
+                    <a:xfrm>
+                      <a:off x="0" y="0"/>
+                      <a:ext cx="3781425" cy="762000"/>
+                    </a:xfrm>
+                    <a:prstGeom prst="rect"/>
+                    <a:ln/>
+                  </pic:spPr>
+                </pic:pic>
+              </a:graphicData>
+            </a:graphic>
+          </wp:inline>
+        </w:drawing>
+      </w:r>
+      <w:r>
+        <w:rPr>
+          <w:rtl w:val="0"/>
+        </w:rPr>
+      </w:r>
+    </w:p>
+    <w:p>
+      <w:pPr>
+        <w:numPr>
+          <w:ilvl w:val="0"/>
+          <w:numId w:val="1"/>
+        </w:numPr>
+        <w:spacing w:line="240" w:lineRule="auto"/>
+        <w:ind w:left="1004" w:hanging="360"/>
+        <w:jc w:val="both"/>
+        <w:rPr>
+          <w:rFonts w:ascii="Times New Roman" w:cs="Times New Roman" w:eastAsia="Times New Roman" w:hAnsi="Times New Roman"/>
+          <w:sz w:val="28"/>
+          <w:szCs w:val="28"/>
+        </w:rPr>
+      </w:pPr>
+      <w:r>
+        <w:rPr>
+          <w:rFonts w:ascii="Times New Roman" w:cs="Times New Roman" w:eastAsia="Times New Roman" w:hAnsi="Times New Roman"/>
+          <w:sz w:val="28"/>
+          <w:szCs w:val="28"/>
+          <w:rtl w:val="0"/>
+        </w:rPr>
+        <w:t xml:space="preserve">**перегляньте інформацію про існуючі групи користувачів.</w:t>
+      </w:r>
+    </w:p>
+    <w:p>
+      <w:pPr>
+        <w:spacing w:line="240" w:lineRule="auto"/>
+        <w:ind w:left="1004" w:firstLine="0"/>
+        <w:jc w:val="both"/>
+        <w:rPr>
+          <w:rFonts w:ascii="Times New Roman" w:cs="Times New Roman" w:eastAsia="Times New Roman" w:hAnsi="Times New Roman"/>
+          <w:sz w:val="28"/>
+          <w:szCs w:val="28"/>
+        </w:rPr>
+      </w:pPr>
+      <w:r>
+        <w:rPr>
+          <w:rtl w:val="0"/>
+        </w:rPr>
+      </w:r>
+    </w:p>
+    <w:p>
+      <w:pPr>
+        <w:spacing w:line="240" w:lineRule="auto"/>
+        <w:jc w:val="both"/>
+        <w:rPr>
+          <w:rFonts w:ascii="Times New Roman" w:cs="Times New Roman" w:eastAsia="Times New Roman" w:hAnsi="Times New Roman"/>
+          <w:sz w:val="28"/>
+          <w:szCs w:val="28"/>
+        </w:rPr>
+      </w:pPr>
+      <w:r>
+        <w:rPr>
+          <w:rFonts w:ascii="Times New Roman" w:cs="Times New Roman" w:eastAsia="Times New Roman" w:hAnsi="Times New Roman"/>
+          <w:sz w:val="28"/>
+          <w:szCs w:val="28"/>
+        </w:rPr>
+        <w:drawing>
+          <wp:inline distB="114300" distT="114300" distL="114300" distR="114300">
+            <wp:extent cx="2952750" cy="5353050"/>
+            <wp:effectExtent b="0" l="0" r="0" t="0"/>
+            <wp:docPr id="10" name="image5.png"/>
+            <a:graphic>
+              <a:graphicData uri="http://schemas.openxmlformats.org/drawingml/2006/picture">
+                <pic:pic>
+                  <pic:nvPicPr>
+                    <pic:cNvPr id="0" name="image5.png"/>
+                    <pic:cNvPicPr preferRelativeResize="0"/>
+                  </pic:nvPicPr>
+                  <pic:blipFill>
+                    <a:blip r:embed="rId24"/>
+                    <a:srcRect b="0" l="0" r="0" t="0"/>
+                    <a:stretch>
+                      <a:fillRect/>
+                    </a:stretch>
+                  </pic:blipFill>
+                  <pic:spPr>
+                    <a:xfrm>
+                      <a:off x="0" y="0"/>
+                      <a:ext cx="2952750" cy="5353050"/>
+                    </a:xfrm>
+                    <a:prstGeom prst="rect"/>
+                    <a:ln/>
+                  </pic:spPr>
+                </pic:pic>
+              </a:graphicData>
+            </a:graphic>
+          </wp:inline>
+        </w:drawing>
+      </w:r>
+      <w:r>
+        <w:rPr>
+          <w:rtl w:val="0"/>
+        </w:rPr>
+      </w:r>
+    </w:p>
+    <w:p>
+      <w:pPr>
+        <w:spacing w:line="240" w:lineRule="auto"/>
+        <w:jc w:val="both"/>
+        <w:rPr>
+          <w:rFonts w:ascii="Times New Roman" w:cs="Times New Roman" w:eastAsia="Times New Roman" w:hAnsi="Times New Roman"/>
+          <w:sz w:val="28"/>
+          <w:szCs w:val="28"/>
+        </w:rPr>
+      </w:pPr>
+      <w:r>
+        <w:rPr>
+          <w:rFonts w:ascii="Times New Roman" w:cs="Times New Roman" w:eastAsia="Times New Roman" w:hAnsi="Times New Roman"/>
+          <w:sz w:val="28"/>
+          <w:szCs w:val="28"/>
+        </w:rPr>
+        <w:drawing>
+          <wp:inline distB="114300" distT="114300" distL="114300" distR="114300">
+            <wp:extent cx="2771775" cy="2466975"/>
+            <wp:effectExtent b="0" l="0" r="0" t="0"/>
+            <wp:docPr id="6" name="image2.png"/>
+            <a:graphic>
+              <a:graphicData uri="http://schemas.openxmlformats.org/drawingml/2006/picture">
+                <pic:pic>
+                  <pic:nvPicPr>
+                    <pic:cNvPr id="0" name="image2.png"/>
+                    <pic:cNvPicPr preferRelativeResize="0"/>
+                  </pic:nvPicPr>
+                  <pic:blipFill>
+                    <a:blip r:embed="rId25"/>
+                    <a:srcRect b="0" l="0" r="0" t="0"/>
+                    <a:stretch>
+                      <a:fillRect/>
+                    </a:stretch>
+                  </pic:blipFill>
+                  <pic:spPr>
+                    <a:xfrm>
+                      <a:off x="0" y="0"/>
+                      <a:ext cx="2771775" cy="2466975"/>
+                    </a:xfrm>
+                    <a:prstGeom prst="rect"/>
+                    <a:ln/>
+                  </pic:spPr>
+                </pic:pic>
+              </a:graphicData>
+            </a:graphic>
+          </wp:inline>
+        </w:drawing>
+      </w:r>
+      <w:r>
+        <w:rPr>
+          <w:rtl w:val="0"/>
+        </w:rPr>
+      </w:r>
+    </w:p>
+    <w:p>
+      <w:pPr>
+        <w:spacing w:line="240" w:lineRule="auto"/>
+        <w:jc w:val="both"/>
+        <w:rPr>
+          <w:rFonts w:ascii="Times New Roman" w:cs="Times New Roman" w:eastAsia="Times New Roman" w:hAnsi="Times New Roman"/>
+          <w:sz w:val="24"/>
+          <w:szCs w:val="24"/>
+        </w:rPr>
+      </w:pPr>
+      <w:r>
+        <w:rPr>
+          <w:rtl w:val="0"/>
+        </w:rPr>
+      </w:r>
+    </w:p>
+    <w:p>
+      <w:pPr>
+        <w:spacing w:line="240" w:lineRule="auto"/>
+        <w:ind w:left="709" w:hanging="283"/>
+        <w:jc w:val="both"/>
+        <w:rPr>
+          <w:rFonts w:ascii="Times New Roman" w:cs="Times New Roman" w:eastAsia="Times New Roman" w:hAnsi="Times New Roman"/>
+          <w:sz w:val="24"/>
+          <w:szCs w:val="24"/>
+        </w:rPr>
+      </w:pPr>
+      <w:r>
+        <w:rPr>
+          <w:rtl w:val="0"/>
+        </w:rPr>
+      </w:r>
+    </w:p>
+    <w:p>
+      <w:pPr>
+        <w:spacing w:line="240" w:lineRule="auto"/>
+        <w:ind w:left="709" w:hanging="283"/>
+        <w:jc w:val="both"/>
+        <w:rPr>
+          <w:rFonts w:ascii="Times New Roman" w:cs="Times New Roman" w:eastAsia="Times New Roman" w:hAnsi="Times New Roman"/>
+          <w:sz w:val="24"/>
+          <w:szCs w:val="24"/>
+        </w:rPr>
+      </w:pPr>
+      <w:r>
+        <w:rPr>
+          <w:rtl w:val="0"/>
+        </w:rPr>
+      </w:r>
+    </w:p>
+    <w:p>
+      <w:pPr>
+        <w:spacing w:line="240" w:lineRule="auto"/>
+        <w:ind w:left="709" w:hanging="283"/>
+        <w:jc w:val="both"/>
+        <w:rPr>
+          <w:rFonts w:ascii="Times New Roman" w:cs="Times New Roman" w:eastAsia="Times New Roman" w:hAnsi="Times New Roman"/>
+          <w:sz w:val="24"/>
+          <w:szCs w:val="24"/>
+        </w:rPr>
+      </w:pPr>
+      <w:r>
+        <w:rPr>
+          <w:rtl w:val="0"/>
+        </w:rPr>
+      </w:r>
+    </w:p>
+    <w:p>
+      <w:pPr>
+        <w:spacing w:line="276" w:lineRule="auto"/>
+        <w:rPr>
+          <w:sz w:val="24"/>
+          <w:szCs w:val="24"/>
+        </w:rPr>
+      </w:pPr>
+      <w:r>
+        <w:rPr>
+          <w:rtl w:val="0"/>
+        </w:rPr>
+      </w:r>
+    </w:p>
+    <w:p>
+      <w:pPr>
+        <w:spacing w:line="240" w:lineRule="auto"/>
+        <w:ind w:left="1440" w:firstLine="0"/>
+        <w:jc w:val="both"/>
+        <w:rPr>
+          <w:rFonts w:ascii="Times New Roman" w:cs="Times New Roman" w:eastAsia="Times New Roman" w:hAnsi="Times New Roman"/>
+          <w:sz w:val="28"/>
+          <w:szCs w:val="28"/>
+        </w:rPr>
+      </w:pPr>
+      <w:r>
+        <w:rPr>
+          <w:rtl w:val="0"/>
+        </w:rPr>
+      </w:r>
+    </w:p>
+    <w:p>
+      <w:pPr>
+        <w:tabs>
+          <w:tab w:val="left" w:leader="none" w:pos="993"/>
+        </w:tabs>
+        <w:spacing w:line="240" w:lineRule="auto"/>
+        <w:ind w:left="567" w:firstLine="0"/>
+        <w:jc w:val="both"/>
+        <w:rPr>
+          <w:rFonts w:ascii="Times New Roman" w:cs="Times New Roman" w:eastAsia="Times New Roman" w:hAnsi="Times New Roman"/>
+          <w:sz w:val="28"/>
+          <w:szCs w:val="28"/>
+        </w:rPr>
+      </w:pPr>
+      <w:r>
+        <w:rPr>
+          <w:rFonts w:ascii="Times New Roman" w:cs="Times New Roman" w:eastAsia="Times New Roman" w:hAnsi="Times New Roman"/>
+          <w:sz w:val="28"/>
+          <w:szCs w:val="28"/>
+          <w:rtl w:val="0"/>
+        </w:rPr>
+        <w:t xml:space="preserve"> </w:t>
+      </w:r>
+    </w:p>
+    <w:p>
+      <w:pPr>
+        <w:spacing w:line="240" w:lineRule="auto"/>
+        <w:jc w:val="both"/>
+        <w:rPr>
+          <w:rFonts w:ascii="Times New Roman" w:cs="Times New Roman" w:eastAsia="Times New Roman" w:hAnsi="Times New Roman"/>
+          <w:b w:val="1"/>
+          <w:bCs w:val="1"/>
+          <w:sz w:val="28"/>
+          <w:szCs w:val="28"/>
+        </w:rPr>
+      </w:pPr>
+      <w:r>
+        <w:rPr>
+          <w:rFonts w:ascii="Times New Roman" w:cs="Times New Roman" w:eastAsia="Times New Roman" w:hAnsi="Times New Roman"/>
+          <w:b w:val="1"/>
+          <w:bCs w:val="1"/>
+          <w:sz w:val="28"/>
+          <w:szCs w:val="28"/>
+          <w:rtl w:val="0"/>
+        </w:rPr>
+        <w:t xml:space="preserve">Контрольні запитання:</w:t>
+      </w:r>
+    </w:p>
+    <w:p>
+      <w:pPr>
+        <w:numPr>
+          <w:ilvl w:val="0"/>
+          <w:numId w:val="2"/>
+        </w:numPr>
+        <w:spacing w:line="240" w:lineRule="auto"/>
+        <w:ind w:left="709" w:hanging="349"/>
+        <w:jc w:val="both"/>
+        <w:rPr>
+          <w:rFonts w:ascii="Times New Roman" w:cs="Times New Roman" w:eastAsia="Times New Roman" w:hAnsi="Times New Roman"/>
+          <w:sz w:val="28"/>
+          <w:szCs w:val="28"/>
+        </w:rPr>
+      </w:pPr>
+      <w:r>
+        <w:rPr>
+          <w:rFonts w:ascii="Times New Roman" w:cs="Times New Roman" w:eastAsia="Times New Roman" w:hAnsi="Times New Roman"/>
+          <w:sz w:val="28"/>
+          <w:szCs w:val="28"/>
+          <w:rtl w:val="0"/>
+        </w:rPr>
+        <w:t xml:space="preserve">Чому в конфігураційних файлах паролі не зберігається в явному вигляді?</w:t>
+      </w:r>
+    </w:p>
+    <w:p>
+      <w:pPr>
+        <w:spacing w:line="240" w:lineRule="auto"/>
+        <w:jc w:val="both"/>
+        <w:rPr>
+          <w:rFonts w:ascii="Times New Roman" w:cs="Times New Roman" w:eastAsia="Times New Roman" w:hAnsi="Times New Roman"/>
+          <w:sz w:val="28"/>
+          <w:szCs w:val="28"/>
+        </w:rPr>
+      </w:pPr>
+      <w:r>
+        <w:rPr>
+          <w:rtl w:val="0"/>
+        </w:rPr>
+      </w:r>
+    </w:p>
+    <w:p>
+      <w:pPr>
+        <w:spacing w:line="240" w:lineRule="auto"/>
+        <w:jc w:val="both"/>
+        <w:rPr>
+          <w:rFonts w:ascii="Times New Roman" w:cs="Times New Roman" w:eastAsia="Times New Roman" w:hAnsi="Times New Roman"/>
+          <w:sz w:val="28"/>
+          <w:szCs w:val="28"/>
+        </w:rPr>
+      </w:pPr>
+      <w:r>
+        <w:rPr>
+          <w:rFonts w:ascii="Times New Roman" w:cs="Times New Roman" w:eastAsia="Times New Roman" w:hAnsi="Times New Roman"/>
+          <w:sz w:val="28"/>
+          <w:szCs w:val="28"/>
+          <w:rtl w:val="0"/>
+        </w:rPr>
+        <w:t xml:space="preserve">Паролі не зберігаються в явному вигляді для забезпечення безпеки. Якщо паролі зберігатимуться у відкритому вигляді, зловмисники, отримавши доступ до конфігураційних файлів, зможуть отримати паролі користувачів і зламати систему. Замість цього паролі зазвичай зберігаються у вигляді хешів, що є односторонніми функціями, які неможливо відновити до початкового значення безпеки</w:t>
+      </w:r>
+    </w:p>
+    <w:p>
+      <w:pPr>
+        <w:spacing w:line="240" w:lineRule="auto"/>
+        <w:jc w:val="both"/>
+        <w:rPr>
+          <w:rFonts w:ascii="Times New Roman" w:cs="Times New Roman" w:eastAsia="Times New Roman" w:hAnsi="Times New Roman"/>
+          <w:sz w:val="28"/>
+          <w:szCs w:val="28"/>
+        </w:rPr>
+      </w:pPr>
+      <w:r>
+        <w:rPr>
+          <w:rtl w:val="0"/>
+        </w:rPr>
+      </w:r>
+    </w:p>
+    <w:p>
+      <w:pPr>
+        <w:numPr>
+          <w:ilvl w:val="0"/>
+          <w:numId w:val="2"/>
+        </w:numPr>
+        <w:spacing w:line="240" w:lineRule="auto"/>
+        <w:ind w:left="709" w:hanging="349"/>
+        <w:jc w:val="both"/>
+        <w:rPr>
+          <w:rFonts w:ascii="Times New Roman" w:cs="Times New Roman" w:eastAsia="Times New Roman" w:hAnsi="Times New Roman"/>
+          <w:sz w:val="28"/>
+          <w:szCs w:val="28"/>
+        </w:rPr>
+      </w:pPr>
+      <w:r>
+        <w:rPr>
+          <w:rFonts w:ascii="Times New Roman" w:cs="Times New Roman" w:eastAsia="Times New Roman" w:hAnsi="Times New Roman"/>
+          <w:sz w:val="28"/>
+          <w:szCs w:val="28"/>
+          <w:rtl w:val="0"/>
+        </w:rPr>
+        <w:t xml:space="preserve">Чому не рекомендується виконувати повсякденні операції, використовуючи обліковий запис root?</w:t>
+      </w:r>
+    </w:p>
+    <w:p>
+      <w:pPr>
+        <w:spacing w:line="240" w:lineRule="auto"/>
+        <w:jc w:val="both"/>
+        <w:rPr>
+          <w:rFonts w:ascii="Times New Roman" w:cs="Times New Roman" w:eastAsia="Times New Roman" w:hAnsi="Times New Roman"/>
+          <w:sz w:val="28"/>
+          <w:szCs w:val="28"/>
+        </w:rPr>
+      </w:pPr>
+      <w:r>
+        <w:rPr>
+          <w:rtl w:val="0"/>
+        </w:rPr>
+      </w:r>
+    </w:p>
+    <w:p>
+      <w:pPr>
+        <w:spacing w:line="240" w:lineRule="auto"/>
+        <w:jc w:val="both"/>
+        <w:rPr>
+          <w:rFonts w:ascii="Times New Roman" w:cs="Times New Roman" w:eastAsia="Times New Roman" w:hAnsi="Times New Roman"/>
+          <w:sz w:val="28"/>
+          <w:szCs w:val="28"/>
+        </w:rPr>
+      </w:pPr>
+      <w:r>
+        <w:rPr>
+          <w:rFonts w:ascii="Times New Roman" w:cs="Times New Roman" w:eastAsia="Times New Roman" w:hAnsi="Times New Roman"/>
+          <w:sz w:val="28"/>
+          <w:szCs w:val="28"/>
+          <w:rtl w:val="0"/>
+        </w:rPr>
+        <w:t xml:space="preserve">Використання облікового запису root для повсякденних операцій небезпечне, оскільки цей користувач має необмежені права на систему. Будь-яка помилка, виконана від імені root, може призвести до серйозних наслідків, таких як випадкове видалення важливих файлів або порушення безпеки. Краще використовувати менш привілейовані облікові записи для повсякденних завдань і застосовувати права root лише в разі необхідності, через команди на зразок sudo. </w:t>
+      </w:r>
+    </w:p>
+    <w:p>
+      <w:pPr>
+        <w:spacing w:line="240" w:lineRule="auto"/>
+        <w:jc w:val="both"/>
+        <w:rPr>
+          <w:rFonts w:ascii="Times New Roman" w:cs="Times New Roman" w:eastAsia="Times New Roman" w:hAnsi="Times New Roman"/>
+          <w:sz w:val="28"/>
+          <w:szCs w:val="28"/>
+        </w:rPr>
+      </w:pPr>
+      <w:r>
+        <w:rPr>
+          <w:rtl w:val="0"/>
+        </w:rPr>
+      </w:r>
+    </w:p>
+    <w:p>
+      <w:pPr>
+        <w:numPr>
+          <w:ilvl w:val="0"/>
+          <w:numId w:val="2"/>
+        </w:numPr>
+        <w:spacing w:line="240" w:lineRule="auto"/>
+        <w:ind w:left="709" w:hanging="349"/>
+        <w:jc w:val="both"/>
+        <w:rPr>
+          <w:rFonts w:ascii="Times New Roman" w:cs="Times New Roman" w:eastAsia="Times New Roman" w:hAnsi="Times New Roman"/>
+          <w:sz w:val="28"/>
+          <w:szCs w:val="28"/>
+        </w:rPr>
+      </w:pPr>
+      <w:r>
+        <w:rPr>
+          <w:rFonts w:ascii="Times New Roman" w:cs="Times New Roman" w:eastAsia="Times New Roman" w:hAnsi="Times New Roman"/>
+          <w:sz w:val="28"/>
+          <w:szCs w:val="28"/>
+          <w:rtl w:val="0"/>
+        </w:rPr>
+        <w:t xml:space="preserve">*У чому відмінність механізмів отримання особливих привілеїв su і sudo?</w:t>
+      </w:r>
+    </w:p>
+    <w:p>
+      <w:pPr>
+        <w:spacing w:line="240" w:lineRule="auto"/>
+        <w:jc w:val="both"/>
+        <w:rPr>
+          <w:rFonts w:ascii="Times New Roman" w:cs="Times New Roman" w:eastAsia="Times New Roman" w:hAnsi="Times New Roman"/>
+          <w:sz w:val="28"/>
+          <w:szCs w:val="28"/>
+        </w:rPr>
+      </w:pPr>
+      <w:r>
+        <w:rPr>
+          <w:rtl w:val="0"/>
+        </w:rPr>
+      </w:r>
+    </w:p>
+    <w:p>
+      <w:pPr>
+        <w:spacing w:line="240" w:lineRule="auto"/>
+        <w:jc w:val="both"/>
+        <w:rPr>
+          <w:rFonts w:ascii="Times New Roman" w:cs="Times New Roman" w:eastAsia="Times New Roman" w:hAnsi="Times New Roman"/>
+          <w:sz w:val="28"/>
+          <w:szCs w:val="28"/>
+        </w:rPr>
+      </w:pPr>
+      <w:r>
+        <w:rPr>
+          <w:rFonts w:ascii="Times New Roman" w:cs="Times New Roman" w:eastAsia="Times New Roman" w:hAnsi="Times New Roman"/>
+          <w:sz w:val="28"/>
+          <w:szCs w:val="28"/>
+          <w:rtl w:val="0"/>
+        </w:rPr>
+        <w:t xml:space="preserve">su (substitute user) дозволяє змінити поточного користувача, найчастіше на root. Використовуючи su, користувач повністю переключається на інший обліковий запис, що дає йому доступ до всіх привілеїв того облікового запису. sudo дозволяє виконувати окремі команди з правами іншого користувача, зазвичай root, без необхідності повного перемикання на цього користувача. sudo також реєструє використання команд для забезпечення аудиту, чого не робить su. </w:t>
+      </w:r>
+    </w:p>
+    <w:p>
+      <w:pPr>
+        <w:spacing w:line="240" w:lineRule="auto"/>
+        <w:jc w:val="both"/>
+        <w:rPr>
+          <w:rFonts w:ascii="Times New Roman" w:cs="Times New Roman" w:eastAsia="Times New Roman" w:hAnsi="Times New Roman"/>
+          <w:sz w:val="28"/>
+          <w:szCs w:val="28"/>
+        </w:rPr>
+      </w:pPr>
+      <w:r>
+        <w:rPr>
+          <w:rtl w:val="0"/>
+        </w:rPr>
+      </w:r>
+    </w:p>
+    <w:p>
+      <w:pPr>
+        <w:numPr>
+          <w:ilvl w:val="0"/>
+          <w:numId w:val="2"/>
+        </w:numPr>
+        <w:spacing w:line="240" w:lineRule="auto"/>
+        <w:ind w:left="709" w:hanging="349"/>
+        <w:jc w:val="both"/>
+        <w:rPr>
+          <w:rFonts w:ascii="Times New Roman" w:cs="Times New Roman" w:eastAsia="Times New Roman" w:hAnsi="Times New Roman"/>
+          <w:sz w:val="28"/>
+          <w:szCs w:val="28"/>
+        </w:rPr>
+      </w:pPr>
+      <w:r>
+        <w:rPr>
+          <w:rFonts w:ascii="Times New Roman" w:cs="Times New Roman" w:eastAsia="Times New Roman" w:hAnsi="Times New Roman"/>
+          <w:sz w:val="28"/>
+          <w:szCs w:val="28"/>
+          <w:rtl w:val="0"/>
+        </w:rPr>
+        <w:t xml:space="preserve">*Чому домашній каталог користувача root не розміщено в каталозі /home?</w:t>
+      </w:r>
+    </w:p>
+    <w:p>
+      <w:pPr>
+        <w:spacing w:line="240" w:lineRule="auto"/>
+        <w:jc w:val="both"/>
+        <w:rPr>
+          <w:rFonts w:ascii="Times New Roman" w:cs="Times New Roman" w:eastAsia="Times New Roman" w:hAnsi="Times New Roman"/>
+          <w:sz w:val="28"/>
+          <w:szCs w:val="28"/>
+        </w:rPr>
+      </w:pPr>
+      <w:r>
+        <w:rPr>
+          <w:rtl w:val="0"/>
+        </w:rPr>
+      </w:r>
+    </w:p>
+    <w:p>
+      <w:pPr>
+        <w:spacing w:line="240" w:lineRule="auto"/>
+        <w:jc w:val="both"/>
+        <w:rPr>
+          <w:rFonts w:ascii="Times New Roman" w:cs="Times New Roman" w:eastAsia="Times New Roman" w:hAnsi="Times New Roman"/>
+          <w:sz w:val="28"/>
+          <w:szCs w:val="28"/>
+        </w:rPr>
+      </w:pPr>
+      <w:r>
+        <w:rPr>
+          <w:rFonts w:ascii="Times New Roman" w:cs="Times New Roman" w:eastAsia="Times New Roman" w:hAnsi="Times New Roman"/>
+          <w:sz w:val="28"/>
+          <w:szCs w:val="28"/>
+          <w:rtl w:val="0"/>
+        </w:rPr>
+        <w:t xml:space="preserve">Домашній каталог root зазвичай знаходиться в /root, а не в /home, оскільки користувач root є спеціальним користувачем, який має права на всю систему і не потребує окремого робочого простору в загальному каталозі користувачів. Це також допомагає виділити root від звичайних користувачів, забезпечуючи більшу організацію та безпеку. </w:t>
+      </w:r>
+    </w:p>
+    <w:p>
+      <w:pPr>
+        <w:spacing w:line="240" w:lineRule="auto"/>
+        <w:jc w:val="both"/>
+        <w:rPr>
+          <w:rFonts w:ascii="Times New Roman" w:cs="Times New Roman" w:eastAsia="Times New Roman" w:hAnsi="Times New Roman"/>
+          <w:sz w:val="28"/>
+          <w:szCs w:val="28"/>
+        </w:rPr>
+      </w:pPr>
+      <w:r>
+        <w:rPr>
+          <w:rtl w:val="0"/>
+        </w:rPr>
+      </w:r>
+    </w:p>
+    <w:p>
+      <w:pPr>
+        <w:numPr>
+          <w:ilvl w:val="0"/>
+          <w:numId w:val="2"/>
+        </w:numPr>
+        <w:spacing w:line="240" w:lineRule="auto"/>
+        <w:ind w:left="709" w:hanging="349"/>
+        <w:jc w:val="both"/>
+        <w:rPr>
+          <w:rFonts w:ascii="Times New Roman" w:cs="Times New Roman" w:eastAsia="Times New Roman" w:hAnsi="Times New Roman"/>
+          <w:sz w:val="28"/>
+          <w:szCs w:val="28"/>
+        </w:rPr>
+      </w:pPr>
+      <w:r>
+        <w:rPr>
+          <w:rFonts w:ascii="Times New Roman" w:cs="Times New Roman" w:eastAsia="Times New Roman" w:hAnsi="Times New Roman"/>
+          <w:sz w:val="28"/>
+          <w:szCs w:val="28"/>
+          <w:rtl w:val="0"/>
+        </w:rPr>
+        <w:t xml:space="preserve">*Для чого використовується команда getent?</w:t>
+      </w:r>
+    </w:p>
+    <w:p>
+      <w:pPr>
+        <w:spacing w:line="240" w:lineRule="auto"/>
+        <w:jc w:val="both"/>
+        <w:rPr>
+          <w:rFonts w:ascii="Times New Roman" w:cs="Times New Roman" w:eastAsia="Times New Roman" w:hAnsi="Times New Roman"/>
+          <w:sz w:val="28"/>
+          <w:szCs w:val="28"/>
+        </w:rPr>
+      </w:pPr>
+      <w:r>
+        <w:rPr>
+          <w:rtl w:val="0"/>
+        </w:rPr>
+      </w:r>
+    </w:p>
+    <w:p>
+      <w:pPr>
+        <w:spacing w:line="240" w:lineRule="auto"/>
+        <w:jc w:val="both"/>
+        <w:rPr>
+          <w:rFonts w:ascii="Times New Roman" w:cs="Times New Roman" w:eastAsia="Times New Roman" w:hAnsi="Times New Roman"/>
+          <w:sz w:val="28"/>
+          <w:szCs w:val="28"/>
+        </w:rPr>
+      </w:pPr>
+      <w:r>
+        <w:rPr>
+          <w:rFonts w:ascii="Times New Roman" w:cs="Times New Roman" w:eastAsia="Times New Roman" w:hAnsi="Times New Roman"/>
+          <w:sz w:val="28"/>
+          <w:szCs w:val="28"/>
+          <w:rtl w:val="0"/>
+        </w:rPr>
+        <w:t xml:space="preserve">Команда getent використовується для отримання інформації з різних баз даних системи, таких як інформація про користувачів, групи, хости, сервіси тощо. Наприклад, її можна використати для перевірки записів з /etc/passwd, /etc/group або для отримання даних з мережевих баз даних. </w:t>
+      </w:r>
+    </w:p>
+    <w:p>
+      <w:pPr>
+        <w:spacing w:line="240" w:lineRule="auto"/>
+        <w:jc w:val="both"/>
+        <w:rPr>
+          <w:rFonts w:ascii="Times New Roman" w:cs="Times New Roman" w:eastAsia="Times New Roman" w:hAnsi="Times New Roman"/>
+          <w:sz w:val="28"/>
+          <w:szCs w:val="28"/>
+        </w:rPr>
+      </w:pPr>
+      <w:r>
+        <w:rPr>
+          <w:rtl w:val="0"/>
+        </w:rPr>
+      </w:r>
+    </w:p>
+    <w:p>
+      <w:pPr>
+        <w:numPr>
+          <w:ilvl w:val="0"/>
+          <w:numId w:val="2"/>
+        </w:numPr>
+        <w:spacing w:line="240" w:lineRule="auto"/>
+        <w:ind w:left="709" w:hanging="349"/>
+        <w:jc w:val="both"/>
+        <w:rPr>
+          <w:rFonts w:ascii="Times New Roman" w:cs="Times New Roman" w:eastAsia="Times New Roman" w:hAnsi="Times New Roman"/>
+          <w:sz w:val="28"/>
+          <w:szCs w:val="28"/>
+        </w:rPr>
+      </w:pPr>
+      <w:r>
+        <w:rPr>
+          <w:rFonts w:ascii="Times New Roman" w:cs="Times New Roman" w:eastAsia="Times New Roman" w:hAnsi="Times New Roman"/>
+          <w:sz w:val="28"/>
+          <w:szCs w:val="28"/>
+          <w:rtl w:val="0"/>
+        </w:rPr>
+        <w:t xml:space="preserve">*Як можна змінити пароль користувача?</w:t>
+      </w:r>
+    </w:p>
+    <w:p>
+      <w:pPr>
+        <w:spacing w:line="240" w:lineRule="auto"/>
+        <w:jc w:val="both"/>
+        <w:rPr>
+          <w:rFonts w:ascii="Times New Roman" w:cs="Times New Roman" w:eastAsia="Times New Roman" w:hAnsi="Times New Roman"/>
+          <w:sz w:val="28"/>
+          <w:szCs w:val="28"/>
+        </w:rPr>
+      </w:pPr>
+      <w:r>
+        <w:rPr>
+          <w:rtl w:val="0"/>
+        </w:rPr>
+      </w:r>
+    </w:p>
+    <w:p>
+      <w:pPr>
+        <w:spacing w:line="240" w:lineRule="auto"/>
+        <w:jc w:val="both"/>
+        <w:rPr>
+          <w:rFonts w:ascii="Times New Roman" w:cs="Times New Roman" w:eastAsia="Times New Roman" w:hAnsi="Times New Roman"/>
+          <w:sz w:val="28"/>
+          <w:szCs w:val="28"/>
+        </w:rPr>
+      </w:pPr>
+      <w:r>
+        <w:rPr>
+          <w:rFonts w:ascii="Times New Roman" w:cs="Times New Roman" w:eastAsia="Times New Roman" w:hAnsi="Times New Roman"/>
+          <w:sz w:val="28"/>
+          <w:szCs w:val="28"/>
+          <w:rtl w:val="0"/>
+        </w:rPr>
+        <w:t xml:space="preserve">Для зміни пароля користувача використовується команда passwd. Адміністратор може змінити пароль для будь-якого користувача, вказавши ім’я користувача після команди, наприклад: passwd user1. Користувач може змінити свій пароль за допомогою цієї ж команди без вказування імені користувача.</w:t>
+      </w:r>
+    </w:p>
+    <w:p>
+      <w:pPr>
+        <w:spacing w:line="240" w:lineRule="auto"/>
+        <w:jc w:val="both"/>
+        <w:rPr>
+          <w:rFonts w:ascii="Times New Roman" w:cs="Times New Roman" w:eastAsia="Times New Roman" w:hAnsi="Times New Roman"/>
+          <w:sz w:val="28"/>
+          <w:szCs w:val="28"/>
+        </w:rPr>
+      </w:pPr>
+      <w:r>
+        <w:rPr>
+          <w:rtl w:val="0"/>
+        </w:rPr>
+      </w:r>
+    </w:p>
+    <w:p>
+      <w:pPr>
+        <w:numPr>
+          <w:ilvl w:val="0"/>
+          <w:numId w:val="2"/>
+        </w:numPr>
+        <w:spacing w:line="240" w:lineRule="auto"/>
+        <w:ind w:left="709" w:hanging="349"/>
+        <w:jc w:val="both"/>
+        <w:rPr>
+          <w:rFonts w:ascii="Times New Roman" w:cs="Times New Roman" w:eastAsia="Times New Roman" w:hAnsi="Times New Roman"/>
+          <w:sz w:val="28"/>
+          <w:szCs w:val="28"/>
+        </w:rPr>
+      </w:pPr>
+      <w:r>
+        <w:rPr>
+          <w:rFonts w:ascii="Times New Roman" w:cs="Times New Roman" w:eastAsia="Times New Roman" w:hAnsi="Times New Roman"/>
+          <w:sz w:val="28"/>
+          <w:szCs w:val="28"/>
+          <w:rtl w:val="0"/>
+        </w:rPr>
+        <w:t xml:space="preserve">**Яким чином можна видалити існуючі групи користувачів? Чи залишиться інформація про них десь у системі?</w:t>
+      </w:r>
+    </w:p>
+    <w:p>
+      <w:pPr>
+        <w:spacing w:line="240" w:lineRule="auto"/>
+        <w:jc w:val="both"/>
+        <w:rPr>
+          <w:rFonts w:ascii="Times New Roman" w:cs="Times New Roman" w:eastAsia="Times New Roman" w:hAnsi="Times New Roman"/>
+          <w:sz w:val="28"/>
+          <w:szCs w:val="28"/>
+        </w:rPr>
+      </w:pPr>
+      <w:r>
+        <w:rPr>
+          <w:rtl w:val="0"/>
+        </w:rPr>
+      </w:r>
+    </w:p>
+    <w:p>
+      <w:pPr>
+        <w:spacing w:line="240" w:lineRule="auto"/>
+        <w:jc w:val="both"/>
+        <w:rPr>
+          <w:rFonts w:ascii="Times New Roman" w:cs="Times New Roman" w:eastAsia="Times New Roman" w:hAnsi="Times New Roman"/>
+          <w:sz w:val="28"/>
+          <w:szCs w:val="28"/>
+        </w:rPr>
+      </w:pPr>
+      <w:r>
+        <w:rPr>
+          <w:rFonts w:ascii="Times New Roman" w:cs="Times New Roman" w:eastAsia="Times New Roman" w:hAnsi="Times New Roman"/>
+          <w:sz w:val="28"/>
+          <w:szCs w:val="28"/>
+          <w:rtl w:val="0"/>
+        </w:rPr>
+        <w:t xml:space="preserve">Для видалення групи користувачів використовується команда groupdel. Вона видаляє групу, але інформація про неї в системі може залишитись у журналах чи конфігураційних файлах, таких як /etc/group, де відображаються всі наявні групи. Тому хоча група і буде видалена з цієї бази, може залишитись інформація про неї в системних записах чи в історії команд. </w:t>
+      </w:r>
+    </w:p>
+    <w:p>
+      <w:pPr>
+        <w:spacing w:line="240" w:lineRule="auto"/>
+        <w:jc w:val="both"/>
+        <w:rPr>
+          <w:rFonts w:ascii="Times New Roman" w:cs="Times New Roman" w:eastAsia="Times New Roman" w:hAnsi="Times New Roman"/>
+          <w:sz w:val="28"/>
+          <w:szCs w:val="28"/>
+        </w:rPr>
+      </w:pPr>
+      <w:r>
+        <w:rPr>
+          <w:rtl w:val="0"/>
+        </w:rPr>
+      </w:r>
+    </w:p>
+    <w:p>
+      <w:pPr>
+        <w:numPr>
+          <w:ilvl w:val="0"/>
+          <w:numId w:val="2"/>
+        </w:numPr>
+        <w:spacing w:line="240" w:lineRule="auto"/>
+        <w:ind w:left="709" w:hanging="349"/>
+        <w:jc w:val="both"/>
+        <w:rPr>
+          <w:rFonts w:ascii="Times New Roman" w:cs="Times New Roman" w:eastAsia="Times New Roman" w:hAnsi="Times New Roman"/>
+          <w:sz w:val="28"/>
+          <w:szCs w:val="28"/>
+        </w:rPr>
+      </w:pPr>
+      <w:r>
+        <w:rPr>
+          <w:rFonts w:ascii="Times New Roman" w:cs="Times New Roman" w:eastAsia="Times New Roman" w:hAnsi="Times New Roman"/>
+          <w:sz w:val="28"/>
+          <w:szCs w:val="28"/>
+          <w:rtl w:val="0"/>
+        </w:rPr>
+        <w:t xml:space="preserve">**Яке призначення команди chage?</w:t>
+      </w:r>
+    </w:p>
+    <w:p>
+      <w:pPr>
+        <w:spacing w:line="240" w:lineRule="auto"/>
+        <w:jc w:val="both"/>
+        <w:rPr>
+          <w:rFonts w:ascii="Times New Roman" w:cs="Times New Roman" w:eastAsia="Times New Roman" w:hAnsi="Times New Roman"/>
+          <w:sz w:val="28"/>
+          <w:szCs w:val="28"/>
+        </w:rPr>
+      </w:pPr>
+      <w:r>
+        <w:rPr>
+          <w:rtl w:val="0"/>
+        </w:rPr>
+      </w:r>
+    </w:p>
+    <w:p>
+      <w:pPr>
+        <w:spacing w:line="240" w:lineRule="auto"/>
+        <w:jc w:val="both"/>
+        <w:rPr>
+          <w:rFonts w:ascii="Times New Roman" w:cs="Times New Roman" w:eastAsia="Times New Roman" w:hAnsi="Times New Roman"/>
+          <w:sz w:val="28"/>
+          <w:szCs w:val="28"/>
+        </w:rPr>
+      </w:pPr>
+      <w:r>
+        <w:rPr>
+          <w:rFonts w:ascii="Times New Roman" w:cs="Times New Roman" w:eastAsia="Times New Roman" w:hAnsi="Times New Roman"/>
+          <w:sz w:val="28"/>
+          <w:szCs w:val="28"/>
+          <w:rtl w:val="0"/>
+        </w:rPr>
+        <w:t xml:space="preserve">Команда chage використовується для зміни параметрів терміну дії пароля користувача, таких як максимальний та мінімальний терміни дії пароля, інтервал між змінами пароля, а також повідомлення про необхідність змінити пароль. </w:t>
+      </w:r>
+    </w:p>
+    <w:p>
+      <w:pPr>
+        <w:spacing w:line="240" w:lineRule="auto"/>
+        <w:jc w:val="both"/>
+        <w:rPr>
+          <w:rFonts w:ascii="Times New Roman" w:cs="Times New Roman" w:eastAsia="Times New Roman" w:hAnsi="Times New Roman"/>
+          <w:sz w:val="28"/>
+          <w:szCs w:val="28"/>
+        </w:rPr>
+      </w:pPr>
+      <w:r>
+        <w:rPr>
+          <w:rtl w:val="0"/>
+        </w:rPr>
+      </w:r>
+    </w:p>
+    <w:p>
+      <w:pPr>
+        <w:numPr>
+          <w:ilvl w:val="0"/>
+          <w:numId w:val="2"/>
         </w:numPr>
         <w:spacing w:line="240" w:lineRule="auto"/>
         <w:ind w:left="709" w:hanging="349"/>
@@ -3217,6 +4509,116 @@
   <w:abstractNum w:abstractNumId="1">
     <w:lvl w:ilvl="0">
       <w:start w:val="1"/>
+      <w:numFmt w:val="bullet"/>
+      <w:lvlText w:val="-"/>
+      <w:lvlJc w:val="left"/>
+      <w:pPr>
+        <w:ind w:left="1004" w:hanging="360"/>
+      </w:pPr>
+      <w:rPr>
+        <w:u w:val="none"/>
+      </w:rPr>
+    </w:lvl>
+    <w:lvl w:ilvl="1">
+      <w:start w:val="1"/>
+      <w:numFmt w:val="bullet"/>
+      <w:lvlText w:val="o"/>
+      <w:lvlJc w:val="left"/>
+      <w:pPr>
+        <w:ind w:left="1724" w:hanging="360"/>
+      </w:pPr>
+      <w:rPr>
+        <w:u w:val="none"/>
+      </w:rPr>
+    </w:lvl>
+    <w:lvl w:ilvl="2">
+      <w:start w:val="1"/>
+      <w:numFmt w:val="bullet"/>
+      <w:lvlText w:val="▪"/>
+      <w:lvlJc w:val="left"/>
+      <w:pPr>
+        <w:ind w:left="2444" w:hanging="360"/>
+      </w:pPr>
+      <w:rPr>
+        <w:u w:val="none"/>
+      </w:rPr>
+    </w:lvl>
+    <w:lvl w:ilvl="3">
+      <w:start w:val="1"/>
+      <w:numFmt w:val="bullet"/>
+      <w:lvlText w:val="●"/>
+      <w:lvlJc w:val="left"/>
+      <w:pPr>
+        <w:ind w:left="3164" w:hanging="360"/>
+      </w:pPr>
+      <w:rPr>
+        <w:u w:val="none"/>
+      </w:rPr>
+    </w:lvl>
+    <w:lvl w:ilvl="4">
+      <w:start w:val="1"/>
+      <w:numFmt w:val="bullet"/>
+      <w:lvlText w:val="o"/>
+      <w:lvlJc w:val="left"/>
+      <w:pPr>
+        <w:ind w:left="3884" w:hanging="360"/>
+      </w:pPr>
+      <w:rPr>
+        <w:u w:val="none"/>
+      </w:rPr>
+    </w:lvl>
+    <w:lvl w:ilvl="5">
+      <w:start w:val="1"/>
+      <w:numFmt w:val="bullet"/>
+      <w:lvlText w:val="▪"/>
+      <w:lvlJc w:val="left"/>
+      <w:pPr>
+        <w:ind w:left="4604" w:hanging="360"/>
+      </w:pPr>
+      <w:rPr>
+        <w:u w:val="none"/>
+      </w:rPr>
+    </w:lvl>
+    <w:lvl w:ilvl="6">
+      <w:start w:val="1"/>
+      <w:numFmt w:val="bullet"/>
+      <w:lvlText w:val="●"/>
+      <w:lvlJc w:val="left"/>
+      <w:pPr>
+        <w:ind w:left="5324" w:hanging="360"/>
+      </w:pPr>
+      <w:rPr>
+        <w:u w:val="none"/>
+      </w:rPr>
+    </w:lvl>
+    <w:lvl w:ilvl="7">
+      <w:start w:val="1"/>
+      <w:numFmt w:val="bullet"/>
+      <w:lvlText w:val="o"/>
+      <w:lvlJc w:val="left"/>
+      <w:pPr>
+        <w:ind w:left="6044" w:hanging="360"/>
+      </w:pPr>
+      <w:rPr>
+        <w:u w:val="none"/>
+      </w:rPr>
+    </w:lvl>
+    <w:lvl w:ilvl="8">
+      <w:start w:val="1"/>
+      <w:numFmt w:val="bullet"/>
+      <w:lvlText w:val="▪"/>
+      <w:lvlJc w:val="left"/>
+      <w:pPr>
+        <w:ind w:left="6764" w:hanging="360"/>
+      </w:pPr>
+      <w:rPr>
+        <w:u w:val="none"/>
+      </w:rPr>
+    </w:lvl>
+  </w:abstractNum>
+  <w:abstractNum w:abstractNumId="2">
+    <w:lvl w:ilvl="0">
+      <w:start w:val="1"/>
       <w:numFmt w:val="decimal"/>
       <w:lvlText w:val="%1."/>
       <w:lvlJc w:val="left"/>
@@ -3324,7 +4726,7 @@
       </w:rPr>
     </w:lvl>
   </w:abstractNum>
-  <w:abstractNum w:abstractNumId="2">
+  <w:abstractNum w:abstractNumId="3">
     <w:lvl w:ilvl="0">
       <w:start w:val="1"/>
       <w:numFmt w:val="decimal"/>
@@ -3428,116 +4830,6 @@
       <w:lvlJc w:val="left"/>
       <w:pPr>
         <w:ind w:left="5400" w:hanging="2160"/>
-      </w:pPr>
-      <w:rPr>
-        <w:u w:val="none"/>
-      </w:rPr>
-    </w:lvl>
-  </w:abstractNum>
-  <w:abstractNum w:abstractNumId="3">
-    <w:lvl w:ilvl="0">
-      <w:start w:val="1"/>
-      <w:numFmt w:val="bullet"/>
-      <w:lvlText w:val="-"/>
-      <w:lvlJc w:val="left"/>
-      <w:pPr>
-        <w:ind w:left="1004" w:hanging="360"/>
-      </w:pPr>
-      <w:rPr>
-        <w:u w:val="none"/>
-      </w:rPr>
-    </w:lvl>
-    <w:lvl w:ilvl="1">
-      <w:start w:val="1"/>
-      <w:numFmt w:val="bullet"/>
-      <w:lvlText w:val="o"/>
-      <w:lvlJc w:val="left"/>
-      <w:pPr>
-        <w:ind w:left="1724" w:hanging="360"/>
-      </w:pPr>
-      <w:rPr>
-        <w:u w:val="none"/>
-      </w:rPr>
-    </w:lvl>
-    <w:lvl w:ilvl="2">
-      <w:start w:val="1"/>
-      <w:numFmt w:val="bullet"/>
-      <w:lvlText w:val="▪"/>
-      <w:lvlJc w:val="left"/>
-      <w:pPr>
-        <w:ind w:left="2444" w:hanging="360"/>
-      </w:pPr>
-      <w:rPr>
-        <w:u w:val="none"/>
-      </w:rPr>
-    </w:lvl>
-    <w:lvl w:ilvl="3">
-      <w:start w:val="1"/>
-      <w:numFmt w:val="bullet"/>
-      <w:lvlText w:val="●"/>
-      <w:lvlJc w:val="left"/>
-      <w:pPr>
-        <w:ind w:left="3164" w:hanging="360"/>
-      </w:pPr>
-      <w:rPr>
-        <w:u w:val="none"/>
-      </w:rPr>
-    </w:lvl>
-    <w:lvl w:ilvl="4">
-      <w:start w:val="1"/>
-      <w:numFmt w:val="bullet"/>
-      <w:lvlText w:val="o"/>
-      <w:lvlJc w:val="left"/>
-      <w:pPr>
-        <w:ind w:left="3884" w:hanging="360"/>
-      </w:pPr>
-      <w:rPr>
-        <w:u w:val="none"/>
-      </w:rPr>
-    </w:lvl>
-    <w:lvl w:ilvl="5">
-      <w:start w:val="1"/>
-      <w:numFmt w:val="bullet"/>
-      <w:lvlText w:val="▪"/>
-      <w:lvlJc w:val="left"/>
-      <w:pPr>
-        <w:ind w:left="4604" w:hanging="360"/>
-      </w:pPr>
-      <w:rPr>
-        <w:u w:val="none"/>
-      </w:rPr>
-    </w:lvl>
-    <w:lvl w:ilvl="6">
-      <w:start w:val="1"/>
-      <w:numFmt w:val="bullet"/>
-      <w:lvlText w:val="●"/>
-      <w:lvlJc w:val="left"/>
-      <w:pPr>
-        <w:ind w:left="5324" w:hanging="360"/>
-      </w:pPr>
-      <w:rPr>
-        <w:u w:val="none"/>
-      </w:rPr>
-    </w:lvl>
-    <w:lvl w:ilvl="7">
-      <w:start w:val="1"/>
-      <w:numFmt w:val="bullet"/>
-      <w:lvlText w:val="o"/>
-      <w:lvlJc w:val="left"/>
-      <w:pPr>
-        <w:ind w:left="6044" w:hanging="360"/>
-      </w:pPr>
-      <w:rPr>
-        <w:u w:val="none"/>
-      </w:rPr>
-    </w:lvl>
-    <w:lvl w:ilvl="8">
-      <w:start w:val="1"/>
-      <w:numFmt w:val="bullet"/>
-      <w:lvlText w:val="▪"/>
-      <w:lvlJc w:val="left"/>
-      <w:pPr>
-        <w:ind w:left="6764" w:hanging="360"/>
       </w:pPr>
       <w:rPr>
         <w:u w:val="none"/>

</xml_diff>